<commit_message>
Update canonical experiments and v2 manuscripts
</commit_message>
<xml_diff>
--- a/연구과정/주법분류_논문초안_국문_v0.docx
+++ b/연구과정/주법분류_논문초안_국문_v0.docx
@@ -2,7 +2,7 @@
 <file path=word/document.xml><?xml version="1.0" encoding="utf-8"?>
 <w:document xmlns:w="http://schemas.openxmlformats.org/wordprocessingml/2006/main" xmlns:m="http://schemas.openxmlformats.org/officeDocument/2006/math" xmlns:r="http://schemas.openxmlformats.org/officeDocument/2006/relationships" xmlns:o="urn:schemas-microsoft-com:office:office" xmlns:v="urn:schemas-microsoft-com:vml" xmlns:w10="urn:schemas-microsoft-com:office:word" xmlns:a="http://schemas.openxmlformats.org/drawingml/2006/main" xmlns:pic="http://schemas.openxmlformats.org/drawingml/2006/picture" xmlns:wp="http://schemas.openxmlformats.org/drawingml/2006/wordprocessingDrawing">
   <w:body>
-    <w:bookmarkStart w:id="34" w:name="Xd310bf23f776331941397d0fb00212594ff20b8"/>
+    <w:bookmarkStart w:id="47" w:name="Xd310bf23f776331941397d0fb00212594ff20b8"/>
     <w:p>
       <w:pPr>
         <w:pStyle w:val="Heading1"/>
@@ -180,7 +180,7 @@
       </w:r>
     </w:p>
     <w:bookmarkEnd w:id="9"/>
-    <w:bookmarkStart w:id="10" w:name="서론-introduction"/>
+    <w:bookmarkStart w:id="10" w:name="X2c3372c000ab81b635a96be7914a55215a25165"/>
     <w:p>
       <w:pPr>
         <w:pStyle w:val="Heading2"/>
@@ -536,7 +536,7 @@
       </w:r>
     </w:p>
     <w:bookmarkEnd w:id="10"/>
-    <w:bookmarkStart w:id="14" w:name="관련-연구-related-work"/>
+    <w:bookmarkStart w:id="14" w:name="X40df35189b8e5b420ac9e5e783330c333a1ea89"/>
     <w:p>
       <w:pPr>
         <w:pStyle w:val="Heading2"/>
@@ -591,7 +591,7 @@
         <w:t xml:space="preserve">분류 연구를 평가 관행 축으로 코딩하여, 본 연구의 세 함정이 위치하는 빈틈을 드러냄으로써 둘을 잇는다.</w:t>
       </w:r>
     </w:p>
-    <w:bookmarkStart w:id="11" w:name="주법-분류-playing-technique-classification"/>
+    <w:bookmarkStart w:id="11" w:name="X4cdfd41d2e3f25f126b980c2f813f4c3502dca9"/>
     <w:p>
       <w:pPr>
         <w:pStyle w:val="Heading3"/>
@@ -621,7 +621,7 @@
         <w:t xml:space="preserve"> </w:t>
       </w:r>
       <w:r>
-        <w:t xml:space="preserve">연주 기법(IPT)을 분류하는 것이다. Su 등[cite, 2014 TASLP]은 본 연구와 정확히 같은 네 악기(바이올린,</w:t>
+        <w:t xml:space="preserve">연주 기법(IPT)을 분류하는 것이다. Su 등[1]은 본 연구와 정확히 같은 네 악기(바이올린,</w:t>
       </w:r>
       <w:r>
         <w:t xml:space="preserve"> </w:t>
@@ -645,13 +645,13 @@
         <w:t xml:space="preserve"> </w:t>
       </w:r>
       <w:r>
-        <w:t xml:space="preserve">Kruger &amp; Jacobs[cite, 2020 JNMR]는 RWC에서 무작위 70/30 분할로 최대 열한 기법을 SVM으로 분류한다.</w:t>
-      </w:r>
-      <w:r>
-        <w:t xml:space="preserve"> </w:t>
-      </w:r>
-      <w:r>
-        <w:t xml:space="preserve">Barbancho 등[cite, 2009 ICASSP]은 수작업 의사결정 흐름도(학습 없음)로 바이올린 여섯 기법을 탐지한다.</w:t>
+        <w:t xml:space="preserve">Kruger &amp; Jacobs[2]는 RWC에서 무작위 70/30 분할로 최대 열한 기법을 SVM으로 분류한다.</w:t>
+      </w:r>
+      <w:r>
+        <w:t xml:space="preserve"> </w:t>
+      </w:r>
+      <w:r>
+        <w:t xml:space="preserve">Barbancho 등[3]은 수작업 의사결정 흐름도(학습 없음)로 바이올린 여섯 기법을 탐지한다.</w:t>
       </w:r>
       <w:r>
         <w:t xml:space="preserve"> </w:t>
@@ -709,25 +709,19 @@
         <w:t xml:space="preserve"> </w:t>
       </w:r>
       <w:r>
-        <w:t xml:space="preserve">변환(scattering transform)으로 대체한다. Lostanlen 등[cite, 2018 DLfM]은 이를 본 연구</w:t>
-      </w:r>
-      <w:r>
-        <w:t xml:space="preserve"> </w:t>
-      </w:r>
-      <w:r>
-        <w:t xml:space="preserve">OrchideaSOL의 전신인 SOL에 도입하고, IPT가 악기 인식보다 어렵다고 규정한다. Wang 등[cite,</w:t>
-      </w:r>
-      <w:r>
-        <w:t xml:space="preserve"> </w:t>
-      </w:r>
-      <w:r>
-        <w:t xml:space="preserve">2020 ICASSP; 2022 TASLP]은 적응형 산란을 중국 대나무 피리로 확장하여 MFCC 대비 macro-F1</w:t>
-      </w:r>
-      <w:r>
-        <w:t xml:space="preserve"> </w:t>
-      </w:r>
-      <w:r>
-        <w:t xml:space="preserve">79.9% 대 35.9%를 보고한다. Ducher &amp; Esling[cite, 2019 ISMIR]은 첼로 IPT를 직교 축들로 분해하고</w:t>
+        <w:t xml:space="preserve">변환(scattering transform)으로 대체한다. Lostanlen 등[4]은 이를 본 연구</w:t>
+      </w:r>
+      <w:r>
+        <w:t xml:space="preserve"> </w:t>
+      </w:r>
+      <w:r>
+        <w:t xml:space="preserve">OrchideaSOL의 전신인 SOL에 도입하고, IPT가 악기 인식보다 어렵다고 규정한다. Wang 등[5, 6]은 적응형 산란을 중국 대나무 피리로 확장하여 MFCC 대비 macro-F1</w:t>
+      </w:r>
+      <w:r>
+        <w:t xml:space="preserve"> </w:t>
+      </w:r>
+      <w:r>
+        <w:t xml:space="preserve">79.9% 대 35.9%를 보고한다. Ducher &amp; Esling[7]은 첼로 IPT를 직교 축들로 분해하고</w:t>
       </w:r>
       <w:r>
         <w:t xml:space="preserve"> </w:t>
@@ -791,7 +785,7 @@
         <w:t xml:space="preserve"> </w:t>
       </w:r>
       <w:r>
-        <w:t xml:space="preserve">탐지기[cite, 2019 arXiv; 2022 ISMIR; 2023 ICASSP]는 노트 온셋 정보를 융합하면 노트 단위 F1이</w:t>
+        <w:t xml:space="preserve">탐지기[8, 9, 10]는 노트 온셋 정보를 융합하면 노트 단위 F1이</w:t>
       </w:r>
       <w:r>
         <w:t xml:space="preserve"> </w:t>
@@ -819,13 +813,7 @@
         <w:t xml:space="preserve"> </w:t>
       </w:r>
       <w:r>
-        <w:t xml:space="preserve">온셋 강도 포락선이 가장 중요한 특징이라는 본 연구 SHAP 결과와 일치한다. 바이올린 보잉[cite,</w:t>
-      </w:r>
-      <w:r>
-        <w:t xml:space="preserve"> </w:t>
-      </w:r>
-      <w:r>
-        <w:t xml:space="preserve">2021 MLwithApps]과 전기 기타[cite, 2025 SciRep]에 대한 CNN-스펙트로그램 연구들은 90% 이상의</w:t>
+        <w:t xml:space="preserve">온셋 강도 포락선이 가장 중요한 특징이라는 본 연구 SHAP 결과와 일치한다. 바이올린 보잉[11]과 전기 기타[12]에 대한 CNN-스펙트로그램 연구들은 90% 이상의</w:t>
       </w:r>
       <w:r>
         <w:t xml:space="preserve"> </w:t>
@@ -855,13 +843,7 @@
         <w:t xml:space="preserve"> </w:t>
       </w:r>
       <w:r>
-        <w:t xml:space="preserve">“파운데이션 모델”</w:t>
-      </w:r>
-      <w:r>
-        <w:t xml:space="preserve"> </w:t>
-      </w:r>
-      <w:r>
-        <w:t xml:space="preserve">질문에 가장 가까운 MERTech[cite, 2024 ICASSP]는</w:t>
+        <w:t xml:space="preserve">"파운데이션 모델" 질문에 가장 가까운 MERTech[13]는</w:t>
       </w:r>
       <w:r>
         <w:t xml:space="preserve"> </w:t>
@@ -873,13 +855,7 @@
         <w:t xml:space="preserve"> </w:t>
       </w:r>
       <w:r>
-        <w:t xml:space="preserve">SOTA(MI-F1 90.0%)를 달성하지만, 바이올린 RWC 기법 분류에서는 53.36%에 그친다. VioPTT[cite,</w:t>
-      </w:r>
-      <w:r>
-        <w:t xml:space="preserve"> </w:t>
-      </w:r>
-      <w:r>
-        <w:t xml:space="preserve">2025 arXiv]는 합성 증강으로 이를 넘어서지만(77.22%) 네 기법만 다룬다(col legno, tremolo,</w:t>
+        <w:t xml:space="preserve">SOTA(MI-F1 90.0%)를 달성하지만, 바이올린 RWC 기법 분류에서는 53.36%에 그친다. VioPTT[14]는 합성 증강으로 이를 넘어서지만(77.22%) 네 기법만 다룬다(col legno, tremolo,</w:t>
       </w:r>
       <w:r>
         <w:t xml:space="preserve"> </w:t>
@@ -931,7 +907,7 @@
         <w:t xml:space="preserve"> </w:t>
       </w:r>
       <w:r>
-        <w:t xml:space="preserve">분류한다[cite, 2018 iWOAR; 2019/2021 FrontPsychol; 2024 JAIT]. 흔히 99%를 넘지만 대개 단일</w:t>
+        <w:t xml:space="preserve">분류한다[15, 16]. 흔히 99%를 넘지만 대개 단일</w:t>
       </w:r>
       <w:r>
         <w:t xml:space="preserve"> </w:t>
@@ -963,7 +939,7 @@
       </w:r>
     </w:p>
     <w:bookmarkEnd w:id="11"/>
-    <w:bookmarkStart w:id="12" w:name="평가-함정-준지도-학습-그리고-ssl-프로빙"/>
+    <w:bookmarkStart w:id="12" w:name="X73fe1d31c22268f93425f26e51b50cc63054c45"/>
     <w:p>
       <w:pPr>
         <w:pStyle w:val="Heading3"/>
@@ -987,13 +963,7 @@
         <w:t xml:space="preserve"> </w:t>
       </w:r>
       <w:r>
-        <w:t xml:space="preserve">본 연구의 핵심적인 방법론적 선조는 Oliver 등[cite, 2018</w:t>
-      </w:r>
-      <w:r>
-        <w:t xml:space="preserve"> </w:t>
-      </w:r>
-      <w:r>
-        <w:t xml:space="preserve">NeurIPS]으로, 이미지 도메인에서 기준선을 제대로 튜닝하면 준지도 학습의 겉보기 이득이 크게</w:t>
+        <w:t xml:space="preserve">본 연구의 핵심적인 방법론적 선조는 Oliver 등[17]으로, 이미지 도메인에서 기준선을 제대로 튜닝하면 준지도 학습의 겉보기 이득이 크게</w:t>
       </w:r>
       <w:r>
         <w:t xml:space="preserve"> </w:t>
@@ -1018,16 +988,13 @@
         <w:t xml:space="preserve">선택-시점 누수</w:t>
       </w:r>
       <w:r>
-        <w:t xml:space="preserve">이다. Musgrave 등[cite, 2020 ECCV]은 거리 학습(metric learning)에 대해 유사한</w:t>
-      </w:r>
-      <w:r>
-        <w:t xml:space="preserve"> </w:t>
-      </w:r>
-      <w:r>
-        <w:t xml:space="preserve">“현실 점검”</w:t>
-      </w:r>
-      <w:r>
-        <w:t xml:space="preserve">을 수행하며, 부풀려진 이득을 약한 기준선과 결함 있는 프로토콜 탓으로 돌린다.</w:t>
+        <w:t xml:space="preserve">이다. Musgrave 등[18]은 거리 학습(metric learning)에 대해 유사한</w:t>
+      </w:r>
+      <w:r>
+        <w:t xml:space="preserve"> </w:t>
+      </w:r>
+      <w:r>
+        <w:t xml:space="preserve">"현실 점검"을 수행하며, 부풀려진 이득을 약한 기준선과 결함 있는 프로토콜 탓으로 돌린다.</w:t>
       </w:r>
     </w:p>
     <w:p>
@@ -1045,37 +1012,43 @@
         <w:t xml:space="preserve"> </w:t>
       </w:r>
       <w:r>
-        <w:t xml:space="preserve">Kapoor &amp; Narayanan[cite, 2023 Patterns]은 17개 분야 294편에서</w:t>
-      </w:r>
-      <w:r>
-        <w:t xml:space="preserve"> </w:t>
-      </w:r>
-      <w:r>
-        <w:t xml:space="preserve">누수를 기록하고 보고 분류 체계(taxonomy)를 제안한다. 본 연구의 함정 (i)은 이들의</w:t>
-      </w:r>
-      <w:r>
-        <w:t xml:space="preserve"> </w:t>
-      </w:r>
-      <w:r>
-        <w:t xml:space="preserve">“모델 선택에</w:t>
-      </w:r>
-      <w:r>
-        <w:t xml:space="preserve"> </w:t>
-      </w:r>
-      <w:r>
-        <w:t xml:space="preserve">테스트셋 정보를 사용”</w:t>
-      </w:r>
-      <w:r>
-        <w:t xml:space="preserve"> </w:t>
-      </w:r>
-      <w:r>
-        <w:t xml:space="preserve">범주의 한 사례로, 자기학습에 국소화되고 전후 표로 정량화된다. 본 연구는</w:t>
-      </w:r>
-      <w:r>
-        <w:t xml:space="preserve"> </w:t>
-      </w:r>
-      <w:r>
-        <w:t xml:space="preserve">이들의</w:t>
+        <w:t xml:space="preserve">Kapoor &amp; Narayanan[19]은 17개 분야 294편에서</w:t>
+      </w:r>
+      <w:r>
+        <w:t xml:space="preserve"> </w:t>
+      </w:r>
+      <w:r>
+        <w:t xml:space="preserve">누수를 기록하고 보고 분류 체계(taxonomy)를 제안한다. 본 연구의 함정 (i)은 이들의 "모델 선택에</w:t>
+      </w:r>
+      <w:r>
+        <w:t xml:space="preserve"> </w:t>
+      </w:r>
+      <w:r>
+        <w:t xml:space="preserve">테스트셋 정보를 사용" 범주의 한 사례로, 자기학습에 국소화되고 전후 표로 정량화된다. 본 연구는</w:t>
+      </w:r>
+      <w:r>
+        <w:t xml:space="preserve"> </w:t>
+      </w:r>
+      <w:r>
+        <w:t xml:space="preserve">이들의 *모델 정보표(model info sheet)*를 §6 점검표의 틀로 채택한다.</w:t>
+      </w:r>
+    </w:p>
+    <w:p>
+      <w:pPr>
+        <w:pStyle w:val="BodyText"/>
+      </w:pPr>
+      <w:r>
+        <w:rPr>
+          <w:b/>
+          <w:bCs/>
+        </w:rPr>
+        <w:t xml:space="preserve">재표집 단위와 분산 분해.</w:t>
+      </w:r>
+      <w:r>
+        <w:t xml:space="preserve"> </w:t>
+      </w:r>
+      <w:r>
+        <w:t xml:space="preserve">Bouthillier 등[20]은 타당한 벤치마크가</w:t>
       </w:r>
       <w:r>
         <w:t xml:space="preserve"> </w:t>
@@ -1085,10 +1058,37 @@
           <w:i/>
           <w:iCs/>
         </w:rPr>
-        <w:t xml:space="preserve">모델 정보표(model info sheet)</w:t>
-      </w:r>
-      <w:r>
-        <w:t xml:space="preserve">를 §6 점검표의 틀로 채택한다.</w:t>
+        <w:t xml:space="preserve">모든</w:t>
+      </w:r>
+      <w:r>
+        <w:t xml:space="preserve"> </w:t>
+      </w:r>
+      <w:r>
+        <w:t xml:space="preserve">분산</w:t>
+      </w:r>
+      <w:r>
+        <w:t xml:space="preserve"> </w:t>
+      </w:r>
+      <w:r>
+        <w:t xml:space="preserve">원천을 모델링해야 한다고 주장한다. 일부(예: 데이터 분할)를 고정한 채 나머지만 재표집하면 없는</w:t>
+      </w:r>
+      <w:r>
+        <w:t xml:space="preserve"> </w:t>
+      </w:r>
+      <w:r>
+        <w:t xml:space="preserve">유의성을 만들어낸다. 이것이 본 연구 함정 (iii)의 일반 이론이다. 테스트 클립만 재표집하고 fold를</w:t>
+      </w:r>
+      <w:r>
+        <w:t xml:space="preserve"> </w:t>
+      </w:r>
+      <w:r>
+        <w:t xml:space="preserve">고정한 부트스트랩은 구간을 2.6~5.0배 좁히고, 지배적 교차악기 분산 성분을 fold 단위로 재표집하면</w:t>
+      </w:r>
+      <w:r>
+        <w:t xml:space="preserve"> </w:t>
+      </w:r>
+      <w:r>
+        <w:t xml:space="preserve">사라지는 차이를 보고한다.</w:t>
       </w:r>
     </w:p>
     <w:p>
@@ -1100,13 +1100,73 @@
           <w:b/>
           <w:bCs/>
         </w:rPr>
-        <w:t xml:space="preserve">재표집 단위와 분산 분해.</w:t>
-      </w:r>
-      <w:r>
-        <w:t xml:space="preserve"> </w:t>
-      </w:r>
-      <w:r>
-        <w:t xml:space="preserve">Bouthillier 등[cite, 2021 MLSys]은 타당한 벤치마크가</w:t>
+        <w:t xml:space="preserve">층별 프로빙과 대조 과제.</w:t>
+      </w:r>
+      <w:r>
+        <w:t xml:space="preserve"> </w:t>
+      </w:r>
+      <w:r>
+        <w:t xml:space="preserve">Pasad 등[21]은 wav2vec2 계열 음성 모델의 초기 층이</w:t>
+      </w:r>
+      <w:r>
+        <w:t xml:space="preserve"> </w:t>
+      </w:r>
+      <w:r>
+        <w:t xml:space="preserve">저수준 음향(mel-filterbank 유사)을 반영하고 상위 층이 전역·의미 구조를 부호화함을 층별로 보인다.</w:t>
+      </w:r>
+      <w:r>
+        <w:t xml:space="preserve"> </w:t>
+      </w:r>
+      <w:r>
+        <w:t xml:space="preserve">MERT는 구조적으로 같은 계열이므로, 이는 온셋 강도 포락선이 트랜스포머 층 이전 합성곱</w:t>
+      </w:r>
+      <w:r>
+        <w:t xml:space="preserve"> </w:t>
+      </w:r>
+      <w:r>
+        <w:t xml:space="preserve">프론트엔드에서 포화(R²=0.77)하는 본 연구 서술자 프로브의 직접적 선례이다. Hewitt &amp; Liang[22]은 프로브가 과제를 스스로 학습하는 것이 아니라 표현을 읽도록 대조 과제(control task)와</w:t>
+      </w:r>
+      <w:r>
+        <w:t xml:space="preserve"> </w:t>
+      </w:r>
+      <w:r>
+        <w:t xml:space="preserve">짝지을 것을 정당화하며, 이는 본 연구가 프로브를 저용량으로 유지하고 크로마 대조군을 두는 근거이다.</w:t>
+      </w:r>
+    </w:p>
+    <w:p>
+      <w:pPr>
+        <w:pStyle w:val="BodyText"/>
+      </w:pPr>
+      <w:r>
+        <w:rPr>
+          <w:b/>
+          <w:bCs/>
+        </w:rPr>
+        <w:t xml:space="preserve">음악 SSL 벤치마크의 프로빙 관행.</w:t>
+      </w:r>
+      <w:r>
+        <w:t xml:space="preserve"> </w:t>
+      </w:r>
+      <w:r>
+        <w:t xml:space="preserve">표준화된 SSL 벤치마크 — 음악의 MARBLE[23],</w:t>
+      </w:r>
+      <w:r>
+        <w:t xml:space="preserve"> </w:t>
+      </w:r>
+      <w:r>
+        <w:t xml:space="preserve">SSL 전반의 USB[24] — 는 본 연구 함정 (ii)에 특정한 방식으로 관련된다. MARBLE의</w:t>
+      </w:r>
+      <w:r>
+        <w:t xml:space="preserve"> </w:t>
+      </w:r>
+      <w:r>
+        <w:t xml:space="preserve">프로빙 헤드는 단일 선형층이 아니라 MLP(은닉 512)이다. 즉 "관행"이 백본을 언더튜닝하는 것이</w:t>
+      </w:r>
+      <w:r>
+        <w:t xml:space="preserve"> </w:t>
+      </w:r>
+      <w:r>
+        <w:t xml:space="preserve">아니라, 마지막 층 단일 선형 헤드에서 출발한</w:t>
       </w:r>
       <w:r>
         <w:t xml:space="preserve"> </w:t>
@@ -1116,183 +1176,32 @@
           <w:i/>
           <w:iCs/>
         </w:rPr>
-        <w:t xml:space="preserve">모든</w:t>
-      </w:r>
-      <w:r>
-        <w:t xml:space="preserve"> </w:t>
-      </w:r>
-      <w:r>
-        <w:t xml:space="preserve">분산</w:t>
-      </w:r>
-      <w:r>
-        <w:t xml:space="preserve"> </w:t>
-      </w:r>
-      <w:r>
-        <w:t xml:space="preserve">원천을 모델링해야 한다고 주장한다. 일부(예: 데이터 분할)를 고정한 채 나머지만 재표집하면 없는</w:t>
-      </w:r>
-      <w:r>
-        <w:t xml:space="preserve"> </w:t>
-      </w:r>
-      <w:r>
-        <w:t xml:space="preserve">유의성을 만들어낸다. 이것이 본 연구 함정 (iii)의 일반 이론이다. 테스트 클립만 재표집하고 fold를</w:t>
-      </w:r>
-      <w:r>
-        <w:t xml:space="preserve"> </w:t>
-      </w:r>
-      <w:r>
-        <w:t xml:space="preserve">고정한 부트스트랩은 구간을 2.6~5.0배 좁히고, 지배적 교차악기 분산 성분을 fold 단위로 재표집하면</w:t>
-      </w:r>
-      <w:r>
-        <w:t xml:space="preserve"> </w:t>
-      </w:r>
-      <w:r>
-        <w:t xml:space="preserve">사라지는 차이를 보고한다.</w:t>
-      </w:r>
-    </w:p>
-    <w:p>
-      <w:pPr>
-        <w:pStyle w:val="BodyText"/>
-      </w:pPr>
-      <w:r>
-        <w:rPr>
-          <w:b/>
-          <w:bCs/>
-        </w:rPr>
-        <w:t xml:space="preserve">층별 프로빙과 대조 과제.</w:t>
-      </w:r>
-      <w:r>
-        <w:t xml:space="preserve"> </w:t>
-      </w:r>
-      <w:r>
-        <w:t xml:space="preserve">Pasad 등[cite, 2021 ASRU]은 wav2vec2 계열 음성 모델의 초기 층이</w:t>
-      </w:r>
-      <w:r>
-        <w:t xml:space="preserve"> </w:t>
-      </w:r>
-      <w:r>
-        <w:t xml:space="preserve">저수준 음향(mel-filterbank 유사)을 반영하고 상위 층이 전역·의미 구조를 부호화함을 층별로 보인다.</w:t>
-      </w:r>
-      <w:r>
-        <w:t xml:space="preserve"> </w:t>
-      </w:r>
-      <w:r>
-        <w:t xml:space="preserve">MERT는 구조적으로 같은 계열이므로, 이는 온셋 강도 포락선이 트랜스포머 층 이전 합성곱</w:t>
-      </w:r>
-      <w:r>
-        <w:t xml:space="preserve"> </w:t>
-      </w:r>
-      <w:r>
-        <w:t xml:space="preserve">프론트엔드에서 포화(R²=0.77)하는 본 연구 서술자 프로브의 직접적 선례이다. Hewitt &amp; Liang[cite,</w:t>
-      </w:r>
-      <w:r>
-        <w:t xml:space="preserve"> </w:t>
-      </w:r>
-      <w:r>
-        <w:t xml:space="preserve">2019 EMNLP]은 프로브가 과제를 스스로 학습하는 것이 아니라 표현을 읽도록 대조 과제(control task)와</w:t>
-      </w:r>
-      <w:r>
-        <w:t xml:space="preserve"> </w:t>
-      </w:r>
-      <w:r>
-        <w:t xml:space="preserve">짝지을 것을 정당화하며, 이는 본 연구가 프로브를 저용량으로 유지하고 크로마 대조군을 두는 근거이다.</w:t>
-      </w:r>
-    </w:p>
-    <w:p>
-      <w:pPr>
-        <w:pStyle w:val="BodyText"/>
-      </w:pPr>
-      <w:r>
-        <w:rPr>
-          <w:b/>
-          <w:bCs/>
-        </w:rPr>
-        <w:t xml:space="preserve">음악 SSL 벤치마크의 프로빙 관행.</w:t>
-      </w:r>
-      <w:r>
-        <w:t xml:space="preserve"> </w:t>
-      </w:r>
-      <w:r>
-        <w:t xml:space="preserve">표준화된 SSL 벤치마크 — 음악의 MARBLE[cite, 2023 arXiv],</w:t>
-      </w:r>
-      <w:r>
-        <w:t xml:space="preserve"> </w:t>
-      </w:r>
-      <w:r>
-        <w:t xml:space="preserve">SSL 전반의 USB[cite, 2022 NeurIPS] — 는 본 연구 함정 (ii)에 특정한 방식으로 관련된다. MARBLE의</w:t>
-      </w:r>
-      <w:r>
-        <w:t xml:space="preserve"> </w:t>
-      </w:r>
-      <w:r>
-        <w:t xml:space="preserve">프로빙 헤드는 단일 선형층이 아니라 MLP(은닉 512)이다. 즉</w:t>
-      </w:r>
-      <w:r>
-        <w:t xml:space="preserve"> </w:t>
-      </w:r>
-      <w:r>
-        <w:t xml:space="preserve">“관행”</w:t>
-      </w:r>
-      <w:r>
-        <w:t xml:space="preserve">이 백본을 언더튜닝하는 것이</w:t>
-      </w:r>
-      <w:r>
-        <w:t xml:space="preserve"> </w:t>
-      </w:r>
-      <w:r>
-        <w:t xml:space="preserve">아니라, 마지막 층 단일 선형 헤드에서 출발한</w:t>
-      </w:r>
-      <w:r>
-        <w:t xml:space="preserve"> </w:t>
-      </w:r>
-      <w:r>
-        <w:rPr>
-          <w:i/>
-          <w:iCs/>
-        </w:rPr>
         <w:t xml:space="preserve">우리 자신</w:t>
       </w:r>
       <w:r>
-        <w:t xml:space="preserve">이 그러하였다. 따라서 함정 (ii)는</w:t>
-      </w:r>
-      <w:r>
-        <w:t xml:space="preserve"> </w:t>
-      </w:r>
-      <w:r>
-        <w:t xml:space="preserve">“학계가</w:t>
-      </w:r>
-      <w:r>
-        <w:t xml:space="preserve"> </w:t>
-      </w:r>
-      <w:r>
-        <w:t xml:space="preserve">SSL을 언더튜닝한다”</w:t>
-      </w:r>
-      <w:r>
-        <w:t xml:space="preserve">가 아니라</w:t>
-      </w:r>
-      <w:r>
-        <w:t xml:space="preserve"> </w:t>
-      </w:r>
-      <w:r>
-        <w:t xml:space="preserve">“프로브 설계(헤드 용량, 층 선택)가 결론을 뒤집을 수 있으며, 우리는</w:t>
-      </w:r>
-      <w:r>
-        <w:t xml:space="preserve"> </w:t>
-      </w:r>
-      <w:r>
-        <w:t xml:space="preserve">관행 이하에서 출발해 한 번 스스로 속았다”</w:t>
-      </w:r>
-      <w:r>
-        <w:t xml:space="preserve">이다. MERT 자체[cite, 2024 ICLR]가 검증 대상 백본이다.</w:t>
-      </w:r>
-      <w:r>
-        <w:t xml:space="preserve"> </w:t>
-      </w:r>
-      <w:r>
-        <w:t xml:space="preserve">분포 이동 하의 미세조정은 Kumar 등[cite, 2022 ICLR]이 다루며, 그들의 LP-FT 효과를 §4.4에서 원용한다.</w:t>
+        <w:t xml:space="preserve">이 그러하였다. 따라서 함정 (ii)는 "학계가</w:t>
+      </w:r>
+      <w:r>
+        <w:t xml:space="preserve"> </w:t>
+      </w:r>
+      <w:r>
+        <w:t xml:space="preserve">SSL을 언더튜닝한다"가 아니라 "프로브 설계(헤드 용량, 층 선택)가 결론을 뒤집을 수 있으며, 우리는</w:t>
+      </w:r>
+      <w:r>
+        <w:t xml:space="preserve"> </w:t>
+      </w:r>
+      <w:r>
+        <w:t xml:space="preserve">관행 이하에서 출발해 한 번 스스로 속았다"이다. MERT 자체[25]가 검증 대상 백본이다.</w:t>
+      </w:r>
+      <w:r>
+        <w:t xml:space="preserve"> </w:t>
+      </w:r>
+      <w:r>
+        <w:t xml:space="preserve">분포 이동 하의 미세조정은 Kumar 등[26]이 다루며, 그들의 LP-FT 효과를 §4.4에서 원용한다.</w:t>
       </w:r>
     </w:p>
     <w:bookmarkEnd w:id="12"/>
-    <w:bookmarkStart w:id="13" w:name="위치-설정-선행-ipt-연구의-평가-관행-코딩"/>
+    <w:bookmarkStart w:id="13" w:name="Xbab7347777750091fa5a2fa2289fa4422abaf3e"/>
     <w:p>
       <w:pPr>
         <w:pStyle w:val="Heading3"/>
@@ -1417,8 +1326,7 @@
     <w:tbl>
       <w:tblPr>
         <w:tblStyle w:val="Table"/>
-        <w:tblW w:type="pct" w:w="5000"/>
-        <w:tblLayout w:type="fixed"/>
+        <w:tblW w:type="auto" w:w="0"/>
         <w:tblLook w:firstRow="1" w:lastRow="0" w:firstColumn="0" w:lastColumn="0" w:noHBand="0" w:noVBand="0" w:val="0020"/>
       </w:tblPr>
       <w:tblGrid>
@@ -1512,7 +1420,7 @@
               <w:pStyle w:val="Compact"/>
             </w:pPr>
             <w:r>
-              <w:t xml:space="preserve">Su 등 2014 [cite]</w:t>
+              <w:t xml:space="preserve">Su 등 2014 [1]</w:t>
             </w:r>
           </w:p>
         </w:tc>
@@ -1569,7 +1477,7 @@
               <w:pStyle w:val="Compact"/>
             </w:pPr>
             <w:r>
-              <w:t xml:space="preserve">Barbancho 2009 [cite]</w:t>
+              <w:t xml:space="preserve">Barbancho 2009 [3]</w:t>
             </w:r>
           </w:p>
         </w:tc>
@@ -1626,7 +1534,7 @@
               <w:pStyle w:val="Compact"/>
             </w:pPr>
             <w:r>
-              <w:t xml:space="preserve">Kruger &amp; Jacobs 2020 [cite]</w:t>
+              <w:t xml:space="preserve">Kruger &amp; Jacobs 2020 [2]</w:t>
             </w:r>
           </w:p>
         </w:tc>
@@ -1683,7 +1591,7 @@
               <w:pStyle w:val="Compact"/>
             </w:pPr>
             <w:r>
-              <w:t xml:space="preserve">Lostanlen 2018 [cite]</w:t>
+              <w:t xml:space="preserve">Lostanlen 2018 [4]</w:t>
             </w:r>
           </w:p>
         </w:tc>
@@ -1740,7 +1648,7 @@
               <w:pStyle w:val="Compact"/>
             </w:pPr>
             <w:r>
-              <w:t xml:space="preserve">Ducher &amp; Esling 2019 [cite]</w:t>
+              <w:t xml:space="preserve">Ducher &amp; Esling 2019 [7]</w:t>
             </w:r>
           </w:p>
         </w:tc>
@@ -1797,7 +1705,7 @@
               <w:pStyle w:val="Compact"/>
             </w:pPr>
             <w:r>
-              <w:t xml:space="preserve">Wang 2020/2022 [cite]</w:t>
+              <w:t xml:space="preserve">Wang 2020/2022 [5, 6]</w:t>
             </w:r>
           </w:p>
         </w:tc>
@@ -1854,7 +1762,7 @@
               <w:pStyle w:val="Compact"/>
             </w:pPr>
             <w:r>
-              <w:t xml:space="preserve">Guzheng/Erhu 2019–2023 [cite]</w:t>
+              <w:t xml:space="preserve">Guzheng/Erhu 2019–2023 [8, 9, 10]</w:t>
             </w:r>
           </w:p>
         </w:tc>
@@ -1911,7 +1819,7 @@
               <w:pStyle w:val="Compact"/>
             </w:pPr>
             <w:r>
-              <w:t xml:space="preserve">Alar 2021 [cite]</w:t>
+              <w:t xml:space="preserve">Alar 2021 [11]</w:t>
             </w:r>
           </w:p>
         </w:tc>
@@ -1968,7 +1876,7 @@
               <w:pStyle w:val="Compact"/>
             </w:pPr>
             <w:r>
-              <w:t xml:space="preserve">MERTech 2024 [cite]</w:t>
+              <w:t xml:space="preserve">MERTech 2024 [13]</w:t>
             </w:r>
           </w:p>
         </w:tc>
@@ -2025,7 +1933,7 @@
               <w:pStyle w:val="Compact"/>
             </w:pPr>
             <w:r>
-              <w:t xml:space="preserve">VioPTT 2025 [cite]</w:t>
+              <w:t xml:space="preserve">VioPTT 2025 [14]</w:t>
             </w:r>
           </w:p>
         </w:tc>
@@ -2082,7 +1990,7 @@
               <w:pStyle w:val="Compact"/>
             </w:pPr>
             <w:r>
-              <w:t xml:space="preserve">SpectroFusionNet 2025 [cite]</w:t>
+              <w:t xml:space="preserve">SpectroFusionNet 2025 [12]</w:t>
             </w:r>
           </w:p>
         </w:tc>
@@ -2244,7 +2152,7 @@
     </w:p>
     <w:bookmarkEnd w:id="13"/>
     <w:bookmarkEnd w:id="14"/>
-    <w:bookmarkStart w:id="21" w:name="데이터-및-방법-data-and-method"/>
+    <w:bookmarkStart w:id="21" w:name="X2e6a06608bec28672bab35f7ee5f08191626e9d"/>
     <w:p>
       <w:pPr>
         <w:pStyle w:val="Heading2"/>
@@ -2253,7 +2161,7 @@
         <w:t xml:space="preserve">3. 데이터 및 방법 (Data and Method)</w:t>
       </w:r>
     </w:p>
-    <w:bookmarkStart w:id="15" w:name="데이터"/>
+    <w:bookmarkStart w:id="15" w:name="X62d06b897ffb47fe484bc8fc9c526be4525631b"/>
     <w:p>
       <w:pPr>
         <w:pStyle w:val="Heading3"/>
@@ -2280,7 +2188,7 @@
         <w:t xml:space="preserve">OrchideaSOL</w:t>
       </w:r>
       <w:r>
-        <w:t xml:space="preserve">[cite]의 현악 부분집합을 사용한다. 네</w:t>
+        <w:t xml:space="preserve">[27]의 현악 부분집합을 사용한다. 네</w:t>
       </w:r>
       <w:r>
         <w:t xml:space="preserve"> </w:t>
@@ -2590,7 +2498,7 @@
       </w:r>
     </w:p>
     <w:bookmarkEnd w:id="15"/>
-    <w:bookmarkStart w:id="16" w:name="평가-프로토콜-악기-단위-교차검증"/>
+    <w:bookmarkStart w:id="16" w:name="X34a791df13c225f7f9169a97757b6a16d7fae1e"/>
     <w:p>
       <w:pPr>
         <w:pStyle w:val="Heading3"/>
@@ -2827,7 +2735,7 @@
       </w:r>
     </w:p>
     <w:bookmarkEnd w:id="16"/>
-    <w:bookmarkStart w:id="17" w:name="특징과-모델"/>
+    <w:bookmarkStart w:id="17" w:name="Xc82ca1028e5936c5fbe4dd1af8bc173ec7c9848"/>
     <w:p>
       <w:pPr>
         <w:pStyle w:val="Heading3"/>
@@ -3082,7 +2990,7 @@
         <w:t xml:space="preserve">MERT-v1-95M</w:t>
       </w:r>
       <w:r>
-        <w:t xml:space="preserve">[cite]을 사용하고, 오디오를 24 kHz로 리샘플링한다. 임베딩은 시간에 대한 평균</w:t>
+        <w:t xml:space="preserve">[25]을 사용하고, 오디오를 24 kHz로 리샘플링한다. 임베딩은 시간에 대한 평균</w:t>
       </w:r>
       <w:r>
         <w:t xml:space="preserve"> </w:t>
@@ -3094,153 +3002,62 @@
         <w:t xml:space="preserve"> </w:t>
       </w:r>
       <w:r>
-        <w:t xml:space="preserve">헤드를 위해 13개 층을 모두 보존한다. 그 위에 분류</w:t>
-      </w:r>
-      <w:r>
-        <w:t xml:space="preserve"> </w:t>
-      </w:r>
-      <w:r>
-        <w:rPr>
-          <w:b/>
-          <w:bCs/>
-        </w:rPr>
-        <w:t xml:space="preserve">헤드</w:t>
-      </w:r>
-      <w:r>
-        <w:t xml:space="preserve"> </w:t>
-      </w:r>
-      <w:r>
-        <w:t xml:space="preserve">— 단일 선형층, MLP-256, 또는 층에 대한</w:t>
-      </w:r>
-      <w:r>
-        <w:t xml:space="preserve"> </w:t>
-      </w:r>
-      <w:r>
-        <w:t xml:space="preserve">학습된 볼록 결합(</w:t>
-      </w:r>
-      <w:r>
-        <w:t xml:space="preserve">“층 가중”</w:t>
-      </w:r>
-      <w:r>
-        <w:t xml:space="preserve">) — 를 학습한다.</w:t>
-      </w:r>
-      <w:r>
-        <w:t xml:space="preserve"> </w:t>
-      </w:r>
-      <w:r>
-        <w:rPr>
-          <w:b/>
-          <w:bCs/>
-        </w:rPr>
-        <w:t xml:space="preserve">CLAP 제로샷</w:t>
-      </w:r>
-      <w:r>
-        <w:t xml:space="preserve">(</w:t>
+        <w:t xml:space="preserve">헤드를 위해</w:t>
+      </w:r>
+      <w:r>
+        <w:t xml:space="preserve"> </w:t>
+      </w:r>
+      <w:r>
+        <w:rPr>
+          <w:b/>
+          <w:bCs/>
+        </w:rPr>
+        <w:t xml:space="preserve">13개 은닉 상태</w:t>
+      </w:r>
+      <w:r>
+        <w:t xml:space="preserve">를 모두 보존한다 — HuggingFace</w:t>
+      </w:r>
+      <w:r>
+        <w:t xml:space="preserve"> </w:t>
       </w:r>
       <w:r>
         <w:rPr>
           <w:rStyle w:val="VerbatimChar"/>
         </w:rPr>
-        <w:t xml:space="preserve">laion/clap-htsat-unfused</w:t>
-      </w:r>
-      <w:r>
-        <w:t xml:space="preserve">) 분류기가</w:t>
-      </w:r>
-      <w:r>
-        <w:t xml:space="preserve"> </w:t>
-      </w:r>
-      <w:r>
-        <w:t xml:space="preserve">무라벨 기준점을 제공한다. 가장 무거운 튜닝 지점인</w:t>
-      </w:r>
-      <w:r>
-        <w:t xml:space="preserve"> </w:t>
-      </w:r>
-      <w:r>
-        <w:rPr>
-          <w:b/>
-          <w:bCs/>
-        </w:rPr>
-        <w:t xml:space="preserve">LoRA</w:t>
-      </w:r>
-      <w:r>
-        <w:t xml:space="preserve">(r=8, α=16, q/v 투영에 적용)는 백본</w:t>
-      </w:r>
-      <w:r>
-        <w:t xml:space="preserve"> </w:t>
-      </w:r>
-      <w:r>
-        <w:t xml:space="preserve">자체를 적응시킨다(§4.4). 모든 모델은 Apple Silicon MPS(CPU 폴백)에서 실행하며, CUDA와</w:t>
-      </w:r>
-      <w:r>
-        <w:t xml:space="preserve"> </w:t>
-      </w:r>
-      <w:r>
-        <w:t xml:space="preserve">bitsandbytes는 사용하지 않는다.</w:t>
-      </w:r>
-    </w:p>
-    <w:bookmarkEnd w:id="17"/>
-    <w:bookmarkStart w:id="18" w:name="튜닝-예산"/>
-    <w:p>
-      <w:pPr>
-        <w:pStyle w:val="Heading3"/>
-      </w:pPr>
-      <w:r>
-        <w:t xml:space="preserve">3.4 튜닝 예산</w:t>
-      </w:r>
-    </w:p>
-    <w:p>
-      <w:pPr>
-        <w:pStyle w:val="FirstParagraph"/>
-      </w:pPr>
-      <w:r>
-        <w:t xml:space="preserve">SVM 대 MERT 비교를 공정하게 만들기 위해, 둘 다</w:t>
-      </w:r>
-      <w:r>
-        <w:t xml:space="preserve"> </w:t>
-      </w:r>
-      <w:r>
-        <w:rPr>
-          <w:rStyle w:val="VerbatimChar"/>
-        </w:rPr>
-        <w:t xml:space="preserve">val_select</w:t>
-      </w:r>
-      <w:r>
-        <w:t xml:space="preserve">에서 튜닝한다(테스트에서는 절대 하지</w:t>
-      </w:r>
-      <w:r>
-        <w:t xml:space="preserve"> </w:t>
-      </w:r>
-      <w:r>
-        <w:t xml:space="preserve">않음). SVM은</w:t>
-      </w:r>
-      <w:r>
-        <w:t xml:space="preserve"> </w:t>
-      </w:r>
-      <w:r>
-        <w:rPr>
-          <w:b/>
-          <w:bCs/>
-        </w:rPr>
-        <w:t xml:space="preserve">12개 설정</w:t>
-      </w:r>
-      <w:r>
-        <w:t xml:space="preserve">(C ∈ {0.1,1,10,100} × γ ∈ {scale,0.01,0.001})을, MERT 헤드는</w:t>
-      </w:r>
-      <w:r>
-        <w:t xml:space="preserve"> </w:t>
-      </w:r>
-      <w:r>
-        <w:rPr>
-          <w:b/>
-          <w:bCs/>
-        </w:rPr>
-        <w:t xml:space="preserve">24개</w:t>
-      </w:r>
-      <w:r>
-        <w:t xml:space="preserve"> </w:t>
-      </w:r>
-      <w:r>
-        <w:t xml:space="preserve">설정(arch ∈ {linear, mlp256} × lr × weight-decay × dropout)을 탐색한다 — 백본에</w:t>
+        <w:t xml:space="preserve">hidden_states</w:t>
+      </w:r>
+      <w:r>
+        <w:t xml:space="preserve"> </w:t>
+      </w:r>
+      <w:r>
+        <w:t xml:space="preserve">색인 기준</w:t>
+      </w:r>
+      <w:r>
+        <w:t xml:space="preserve"> </w:t>
+      </w:r>
+      <w:r>
+        <w:rPr>
+          <w:b/>
+          <w:bCs/>
+        </w:rPr>
+        <w:t xml:space="preserve">L0는</w:t>
+      </w:r>
+      <w:r>
+        <w:rPr>
+          <w:b/>
+          <w:bCs/>
+        </w:rPr>
+        <w:t xml:space="preserve"> </w:t>
+      </w:r>
+      <w:r>
+        <w:rPr>
+          <w:b/>
+          <w:bCs/>
+        </w:rPr>
+        <w:t xml:space="preserve">합성곱 특징 인코더에 이은 feature-projection 출력</w:t>
+      </w:r>
+      <w:r>
+        <w:t xml:space="preserve">(첫 트랜스포머 블록</w:t>
       </w:r>
       <w:r>
         <w:t xml:space="preserve"> </w:t>
@@ -3250,29 +3067,122 @@
           <w:i/>
           <w:iCs/>
         </w:rPr>
-        <w:t xml:space="preserve">더 큰</w:t>
-      </w:r>
-      <w:r>
-        <w:t xml:space="preserve"> </w:t>
-      </w:r>
-      <w:r>
-        <w:t xml:space="preserve">예산을</w:t>
-      </w:r>
-      <w:r>
-        <w:t xml:space="preserve"> </w:t>
-      </w:r>
-      <w:r>
-        <w:t xml:space="preserve">부여하여 언더튜닝을 방지한다(§4.2).</w:t>
-      </w:r>
-    </w:p>
-    <w:bookmarkEnd w:id="18"/>
-    <w:bookmarkStart w:id="19" w:name="불확실성-정량화"/>
+        <w:t xml:space="preserve">이전</w:t>
+      </w:r>
+      <w:r>
+        <w:t xml:space="preserve">)이고,</w:t>
+      </w:r>
+      <w:r>
+        <w:t xml:space="preserve"> </w:t>
+      </w:r>
+      <w:r>
+        <w:rPr>
+          <w:b/>
+          <w:bCs/>
+        </w:rPr>
+        <w:t xml:space="preserve">L1–L12가</w:t>
+      </w:r>
+      <w:r>
+        <w:rPr>
+          <w:b/>
+          <w:bCs/>
+        </w:rPr>
+        <w:t xml:space="preserve"> </w:t>
+      </w:r>
+      <w:r>
+        <w:rPr>
+          <w:b/>
+          <w:bCs/>
+        </w:rPr>
+        <w:t xml:space="preserve">12개 트랜스포머 층</w:t>
+      </w:r>
+      <w:r>
+        <w:t xml:space="preserve">이다. 본 논문에서 "합성곱 프론트엔드(L0)"는 이 트랜스포머 이전 상태를 가리킨다. 그 위에 분류</w:t>
+      </w:r>
+      <w:r>
+        <w:t xml:space="preserve"> </w:t>
+      </w:r>
+      <w:r>
+        <w:rPr>
+          <w:b/>
+          <w:bCs/>
+        </w:rPr>
+        <w:t xml:space="preserve">헤드</w:t>
+      </w:r>
+      <w:r>
+        <w:t xml:space="preserve"> </w:t>
+      </w:r>
+      <w:r>
+        <w:t xml:space="preserve">— 단일 선형층, MLP-256, 또는 층에 대한</w:t>
+      </w:r>
+      <w:r>
+        <w:t xml:space="preserve"> </w:t>
+      </w:r>
+      <w:r>
+        <w:t xml:space="preserve">학습된 볼록 결합("층 가중") — 를 학습한다.</w:t>
+      </w:r>
+      <w:r>
+        <w:t xml:space="preserve"> </w:t>
+      </w:r>
+      <w:r>
+        <w:rPr>
+          <w:b/>
+          <w:bCs/>
+        </w:rPr>
+        <w:t xml:space="preserve">CLAP 제로샷</w:t>
+      </w:r>
+      <w:r>
+        <w:t xml:space="preserve">(</w:t>
+      </w:r>
+      <w:r>
+        <w:rPr>
+          <w:rStyle w:val="VerbatimChar"/>
+        </w:rPr>
+        <w:t xml:space="preserve">laion/clap-htsat-unfused</w:t>
+      </w:r>
+      <w:r>
+        <w:t xml:space="preserve">) 분류기가</w:t>
+      </w:r>
+      <w:r>
+        <w:t xml:space="preserve"> </w:t>
+      </w:r>
+      <w:r>
+        <w:t xml:space="preserve">무라벨 기준점을 제공한다. 가장 무거운 튜닝 지점인</w:t>
+      </w:r>
+      <w:r>
+        <w:t xml:space="preserve"> </w:t>
+      </w:r>
+      <w:r>
+        <w:rPr>
+          <w:b/>
+          <w:bCs/>
+        </w:rPr>
+        <w:t xml:space="preserve">LoRA</w:t>
+      </w:r>
+      <w:r>
+        <w:t xml:space="preserve">(r=8, α=16, q/v 투영에 적용)는 백본</w:t>
+      </w:r>
+      <w:r>
+        <w:t xml:space="preserve"> </w:t>
+      </w:r>
+      <w:r>
+        <w:t xml:space="preserve">자체를 적응시킨다(§4.4). 모든 모델은 Apple Silicon MPS(CPU 폴백)에서 실행하며, CUDA와</w:t>
+      </w:r>
+      <w:r>
+        <w:t xml:space="preserve"> </w:t>
+      </w:r>
+      <w:r>
+        <w:t xml:space="preserve">bitsandbytes는 사용하지 않는다.</w:t>
+      </w:r>
+    </w:p>
+    <w:bookmarkEnd w:id="17"/>
+    <w:bookmarkStart w:id="18" w:name="X7ab0da79f15faea7c53a2a6f00b9924414da09e"/>
     <w:p>
       <w:pPr>
         <w:pStyle w:val="Heading3"/>
       </w:pPr>
       <w:r>
-        <w:t xml:space="preserve">3.5 불확실성 정량화</w:t>
+        <w:t xml:space="preserve">3.4 튜닝 예산</w:t>
       </w:r>
     </w:p>
     <w:p>
@@ -3280,74 +3190,54 @@
         <w:pStyle w:val="FirstParagraph"/>
       </w:pPr>
       <w:r>
-        <w:rPr>
-          <w:b/>
-          <w:bCs/>
-        </w:rPr>
-        <w:t xml:space="preserve">BCa 부트스트랩</w:t>
-      </w:r>
-      <w:r>
-        <w:t xml:space="preserve">(B=2,000, 95%)을 보고한다. 한 녹음의 클립들은 강하게 상관되어 있으므로, 클립</w:t>
-      </w:r>
-      <w:r>
-        <w:t xml:space="preserve"> </w:t>
-      </w:r>
-      <w:r>
-        <w:t xml:space="preserve">단위가 아니라</w:t>
-      </w:r>
-      <w:r>
-        <w:t xml:space="preserve"> </w:t>
-      </w:r>
-      <w:r>
-        <w:rPr>
-          <w:b/>
-          <w:bCs/>
-        </w:rPr>
-        <w:t xml:space="preserve">녹음 클러스터</w:t>
-      </w:r>
-      <w:r>
-        <w:t xml:space="preserve"> </w:t>
-      </w:r>
-      <w:r>
-        <w:t xml:space="preserve">단위로 재표집한다. 결정적으로, 주장이 악기를 가로질러 일반화되므로,</w:t>
-      </w:r>
-      <w:r>
-        <w:t xml:space="preserve"> </w:t>
-      </w:r>
-      <w:r>
-        <w:t xml:space="preserve">지배적 분산 성분인</w:t>
-      </w:r>
-      <w:r>
-        <w:t xml:space="preserve"> </w:t>
-      </w:r>
-      <w:r>
-        <w:rPr>
-          <w:b/>
-          <w:bCs/>
-        </w:rPr>
-        <w:t xml:space="preserve">악기/fold</w:t>
-      </w:r>
-      <w:r>
-        <w:t xml:space="preserve"> </w:t>
-      </w:r>
-      <w:r>
-        <w:t xml:space="preserve">단위를 재표집하는</w:t>
-      </w:r>
-      <w:r>
-        <w:t xml:space="preserve"> </w:t>
-      </w:r>
-      <w:r>
-        <w:rPr>
-          <w:b/>
-          <w:bCs/>
-        </w:rPr>
-        <w:t xml:space="preserve">2수준</w:t>
-      </w:r>
-      <w:r>
-        <w:t xml:space="preserve"> </w:t>
-      </w:r>
-      <w:r>
-        <w:t xml:space="preserve">부트스트랩도 함께 보고하고,</w:t>
+        <w:t xml:space="preserve">SVM 대 MERT 비교를 공정하게 만들기 위해, 둘 다</w:t>
+      </w:r>
+      <w:r>
+        <w:t xml:space="preserve"> </w:t>
+      </w:r>
+      <w:r>
+        <w:rPr>
+          <w:rStyle w:val="VerbatimChar"/>
+        </w:rPr>
+        <w:t xml:space="preserve">val_select</w:t>
+      </w:r>
+      <w:r>
+        <w:t xml:space="preserve">에서 튜닝한다(테스트에서는 절대 하지</w:t>
+      </w:r>
+      <w:r>
+        <w:t xml:space="preserve"> </w:t>
+      </w:r>
+      <w:r>
+        <w:t xml:space="preserve">않음). SVM은</w:t>
+      </w:r>
+      <w:r>
+        <w:t xml:space="preserve"> </w:t>
+      </w:r>
+      <w:r>
+        <w:rPr>
+          <w:b/>
+          <w:bCs/>
+        </w:rPr>
+        <w:t xml:space="preserve">12개 설정</w:t>
+      </w:r>
+      <w:r>
+        <w:t xml:space="preserve">(C ∈ {0.1,1,10,100} × γ ∈ {scale,0.01,0.001})을, MERT 헤드는</w:t>
+      </w:r>
+      <w:r>
+        <w:t xml:space="preserve"> </w:t>
+      </w:r>
+      <w:r>
+        <w:rPr>
+          <w:b/>
+          <w:bCs/>
+        </w:rPr>
+        <w:t xml:space="preserve">24개</w:t>
+      </w:r>
+      <w:r>
+        <w:t xml:space="preserve"> </w:t>
+      </w:r>
+      <w:r>
+        <w:t xml:space="preserve">설정(arch ∈ {linear, mlp256} × lr × weight-decay × dropout)을 탐색한다 — 백본에</w:t>
       </w:r>
       <w:r>
         <w:t xml:space="preserve"> </w:t>
@@ -3357,29 +3247,29 @@
           <w:i/>
           <w:iCs/>
         </w:rPr>
-        <w:t xml:space="preserve">그것의</w:t>
-      </w:r>
-      <w:r>
-        <w:t xml:space="preserve"> </w:t>
-      </w:r>
-      <w:r>
-        <w:t xml:space="preserve">0 포함 여부를 유의성 검정으로 삼는다(§4.3). 네 악기에서 이 구간은 필연적으로 넓다. 그 폭은 숨길</w:t>
-      </w:r>
-      <w:r>
-        <w:t xml:space="preserve"> </w:t>
-      </w:r>
-      <w:r>
-        <w:t xml:space="preserve">결함이 아니라 정직한 답이다.</w:t>
-      </w:r>
-    </w:p>
-    <w:bookmarkEnd w:id="19"/>
-    <w:bookmarkStart w:id="20" w:name="해석가능성-서술자-프로브와-shap"/>
+        <w:t xml:space="preserve">더 큰</w:t>
+      </w:r>
+      <w:r>
+        <w:t xml:space="preserve"> </w:t>
+      </w:r>
+      <w:r>
+        <w:t xml:space="preserve">예산을</w:t>
+      </w:r>
+      <w:r>
+        <w:t xml:space="preserve"> </w:t>
+      </w:r>
+      <w:r>
+        <w:t xml:space="preserve">부여하여 언더튜닝을 방지한다(§4.2).</w:t>
+      </w:r>
+    </w:p>
+    <w:bookmarkEnd w:id="18"/>
+    <w:bookmarkStart w:id="19" w:name="X75db7e1fdf32828fe1aa4b615abfe9154f422b0"/>
     <w:p>
       <w:pPr>
         <w:pStyle w:val="Heading3"/>
       </w:pPr>
       <w:r>
-        <w:t xml:space="preserve">3.6 해석가능성: 서술자 프로브와 SHAP</w:t>
+        <w:t xml:space="preserve">3.5 불확실성 정량화</w:t>
       </w:r>
     </w:p>
     <w:p>
@@ -3387,7 +3277,74 @@
         <w:pStyle w:val="FirstParagraph"/>
       </w:pPr>
       <w:r>
-        <w:t xml:space="preserve">두 분석이</w:t>
+        <w:rPr>
+          <w:b/>
+          <w:bCs/>
+        </w:rPr>
+        <w:t xml:space="preserve">BCa 부트스트랩</w:t>
+      </w:r>
+      <w:r>
+        <w:t xml:space="preserve">(B=2,000, 95%)을 보고한다. 한 녹음의 클립들은 강하게 상관되어 있으므로, 클립</w:t>
+      </w:r>
+      <w:r>
+        <w:t xml:space="preserve"> </w:t>
+      </w:r>
+      <w:r>
+        <w:t xml:space="preserve">단위가 아니라</w:t>
+      </w:r>
+      <w:r>
+        <w:t xml:space="preserve"> </w:t>
+      </w:r>
+      <w:r>
+        <w:rPr>
+          <w:b/>
+          <w:bCs/>
+        </w:rPr>
+        <w:t xml:space="preserve">녹음 클러스터</w:t>
+      </w:r>
+      <w:r>
+        <w:t xml:space="preserve"> </w:t>
+      </w:r>
+      <w:r>
+        <w:t xml:space="preserve">단위로 재표집한다. 결정적으로, 주장이 악기를 가로질러 일반화되므로,</w:t>
+      </w:r>
+      <w:r>
+        <w:t xml:space="preserve"> </w:t>
+      </w:r>
+      <w:r>
+        <w:t xml:space="preserve">지배적 분산 성분인</w:t>
+      </w:r>
+      <w:r>
+        <w:t xml:space="preserve"> </w:t>
+      </w:r>
+      <w:r>
+        <w:rPr>
+          <w:b/>
+          <w:bCs/>
+        </w:rPr>
+        <w:t xml:space="preserve">악기/fold</w:t>
+      </w:r>
+      <w:r>
+        <w:t xml:space="preserve"> </w:t>
+      </w:r>
+      <w:r>
+        <w:t xml:space="preserve">단위를 재표집하는</w:t>
+      </w:r>
+      <w:r>
+        <w:t xml:space="preserve"> </w:t>
+      </w:r>
+      <w:r>
+        <w:rPr>
+          <w:b/>
+          <w:bCs/>
+        </w:rPr>
+        <w:t xml:space="preserve">2수준</w:t>
+      </w:r>
+      <w:r>
+        <w:t xml:space="preserve"> </w:t>
+      </w:r>
+      <w:r>
+        <w:t xml:space="preserve">부트스트랩도 함께 보고하고,</w:t>
       </w:r>
       <w:r>
         <w:t xml:space="preserve"> </w:t>
@@ -3397,6 +3354,46 @@
           <w:i/>
           <w:iCs/>
         </w:rPr>
+        <w:t xml:space="preserve">그것의</w:t>
+      </w:r>
+      <w:r>
+        <w:t xml:space="preserve"> </w:t>
+      </w:r>
+      <w:r>
+        <w:t xml:space="preserve">0 포함 여부를 유의성 검정으로 삼는다(§4.3). 네 악기에서 이 구간은 필연적으로 넓다. 그 폭은 숨길</w:t>
+      </w:r>
+      <w:r>
+        <w:t xml:space="preserve"> </w:t>
+      </w:r>
+      <w:r>
+        <w:t xml:space="preserve">결함이 아니라 정직한 답이다.</w:t>
+      </w:r>
+    </w:p>
+    <w:bookmarkEnd w:id="19"/>
+    <w:bookmarkStart w:id="20" w:name="Xf4fcf09c7e40a89e1344ae0d46f070490893b68"/>
+    <w:p>
+      <w:pPr>
+        <w:pStyle w:val="Heading3"/>
+      </w:pPr>
+      <w:r>
+        <w:t xml:space="preserve">3.6 해석가능성: 서술자 프로브와 SHAP</w:t>
+      </w:r>
+    </w:p>
+    <w:p>
+      <w:pPr>
+        <w:pStyle w:val="FirstParagraph"/>
+      </w:pPr>
+      <w:r>
+        <w:t xml:space="preserve">두 분석이</w:t>
+      </w:r>
+      <w:r>
+        <w:t xml:space="preserve"> </w:t>
+      </w:r>
+      <w:r>
+        <w:rPr>
+          <w:i/>
+          <w:iCs/>
+        </w:rPr>
         <w:t xml:space="preserve">이유</w:t>
       </w:r>
       <w:r>
@@ -3440,16 +3437,7 @@
         <w:t xml:space="preserve"> </w:t>
       </w:r>
       <w:r>
-        <w:t xml:space="preserve">각 층을</w:t>
-      </w:r>
-      <w:r>
-        <w:t xml:space="preserve"> </w:t>
-      </w:r>
-      <w:r>
-        <w:t xml:space="preserve">“이 서술자가 여기서 얼마나 선형적으로 가용한가”</w:t>
-      </w:r>
-      <w:r>
-        <w:t xml:space="preserve">로 읽는다. 크로마는 Hewitt &amp; Liang[cite]의</w:t>
+        <w:t xml:space="preserve">각 층을 "이 서술자가 여기서 얼마나 선형적으로 가용한가"로 읽는다. 크로마는 Hewitt &amp; Liang[22]의</w:t>
       </w:r>
       <w:r>
         <w:t xml:space="preserve"> </w:t>
@@ -3497,7 +3485,7 @@
         <w:t xml:space="preserve">표본 외</w:t>
       </w:r>
       <w:r>
-        <w:t xml:space="preserve">(Cohen’s κ)로</w:t>
+        <w:t xml:space="preserve">(Cohen's κ)로</w:t>
       </w:r>
       <w:r>
         <w:t xml:space="preserve"> </w:t>
@@ -3515,7 +3503,7 @@
     </w:p>
     <w:bookmarkEnd w:id="20"/>
     <w:bookmarkEnd w:id="21"/>
-    <w:bookmarkStart w:id="26" w:name="결과-results"/>
+    <w:bookmarkStart w:id="26" w:name="X2cba072265f49f23f603bb307179f1d5249ac54"/>
     <w:p>
       <w:pPr>
         <w:pStyle w:val="Heading2"/>
@@ -3612,7 +3600,7 @@
         <w:t xml:space="preserve">, 80%)을 보고한다.</w:t>
       </w:r>
     </w:p>
-    <w:bookmarkStart w:id="22" w:name="함정-i-선택-시점-테스트셋-누수-첫-번째-반전"/>
+    <w:bookmarkStart w:id="22" w:name="Xcb9ac232e2254c33ca9a69c9c9d549fbe6439f9"/>
     <w:p>
       <w:pPr>
         <w:pStyle w:val="Heading3"/>
@@ -3949,19 +3937,30 @@
     </w:tbl>
     <w:p>
       <w:pPr>
-        <w:pStyle w:val="BodyText"/>
-      </w:pPr>
-      <w:r>
-        <w:t xml:space="preserve">하락폭은 라벨이 줄수록 커지며(5%에서 −0.107), 이는</w:t>
-      </w:r>
-      <w:r>
-        <w:t xml:space="preserve"> </w:t>
-      </w:r>
-      <w:r>
-        <w:t xml:space="preserve">“회차 선택 이득”</w:t>
-      </w:r>
-      <w:r>
-        <w:t xml:space="preserve">이 대부분 누수된 테스트</w:t>
+        <w:pStyle w:val="BlockText"/>
+      </w:pPr>
+      <w:r>
+        <w:t xml:space="preserve">위 4행(5~50%)은 동일 도메인 시드 예산 조건이다. 마지막 "교차도메인" 행은 다른 설정 —</w:t>
+      </w:r>
+      <w:r>
+        <w:t xml:space="preserve"> </w:t>
+      </w:r>
+      <w:r>
+        <w:t xml:space="preserve">Phase 4의 도메인 밖 풀(Philharmonia 전이)에 동일 누수 감사를 적용한 결과 — 로, 참고용으로</w:t>
+      </w:r>
+      <w:r>
+        <w:t xml:space="preserve"> </w:t>
+      </w:r>
+      <w:r>
+        <w:t xml:space="preserve">나란히 둔다. 누수 제거 효과의 방향(음수)이 도메인이 바뀌어도 일관됨을 보인다.</w:t>
+      </w:r>
+    </w:p>
+    <w:p>
+      <w:pPr>
+        <w:pStyle w:val="FirstParagraph"/>
+      </w:pPr>
+      <w:r>
+        <w:t xml:space="preserve">하락폭은 라벨이 줄수록 커지며(5%에서 −0.107), 이는 "회차 선택 이득"이 대부분 누수된 테스트</w:t>
       </w:r>
       <w:r>
         <w:t xml:space="preserve"> </w:t>
@@ -3980,22 +3979,13 @@
         <w:t xml:space="preserve">교차점</w:t>
       </w:r>
       <w:r>
-        <w:t xml:space="preserve">을 만들어냈다. 누수 파이프라인에서 MERT+자기학습은 5~10% 예산에서 SVM을 앞서</w:t>
-      </w:r>
-      <w:r>
-        <w:t xml:space="preserve"> </w:t>
-      </w:r>
-      <w:r>
-        <w:t xml:space="preserve">“제한</w:t>
-      </w:r>
-      <w:r>
-        <w:t xml:space="preserve"> </w:t>
-      </w:r>
-      <w:r>
-        <w:t xml:space="preserve">라벨에서 파운데이션 모델이 우세하다”</w:t>
-      </w:r>
-      <w:r>
-        <w:t xml:space="preserve">는 해석을 뒷받침했다. 누수를 제거하면 SVM이</w:t>
+        <w:t xml:space="preserve">을 만들어냈다. 누수 파이프라인에서 MERT+자기학습은 5~10% 예산에서 SVM을 앞서 "제한</w:t>
+      </w:r>
+      <w:r>
+        <w:t xml:space="preserve"> </w:t>
+      </w:r>
+      <w:r>
+        <w:t xml:space="preserve">라벨에서 파운데이션 모델이 우세하다"는 해석을 뒷받침했다. 누수를 제거하면 SVM이</w:t>
       </w:r>
       <w:r>
         <w:t xml:space="preserve"> </w:t>
@@ -4035,9 +4025,40 @@
         </w:rPr>
         <w:t xml:space="preserve">교차점 — 그리고 그에 기댄 결론 — 이 사라진다.</w:t>
       </w:r>
+      <w:r>
+        <w:t xml:space="preserve"> </w:t>
+      </w:r>
+      <w:r>
+        <w:t xml:space="preserve">참고로 §3.3의 무라벨 기준점인 CLAP</w:t>
+      </w:r>
+      <w:r>
+        <w:t xml:space="preserve"> </w:t>
+      </w:r>
+      <w:r>
+        <w:t xml:space="preserve">제로짓 분류기는 전 예산에서 macro-F1</w:t>
+      </w:r>
+      <w:r>
+        <w:t xml:space="preserve"> </w:t>
+      </w:r>
+      <w:r>
+        <w:rPr>
+          <w:b/>
+          <w:bCs/>
+        </w:rPr>
+        <w:t xml:space="preserve">0.363</w:t>
+      </w:r>
+      <w:r>
+        <w:t xml:space="preserve">(시드 무관 상수)에 머물러, 모든 학습 모델을 크게</w:t>
+      </w:r>
+      <w:r>
+        <w:t xml:space="preserve"> </w:t>
+      </w:r>
+      <w:r>
+        <w:t xml:space="preserve">밑돈다 — "라벨 0개" 하한을 고정하며, 위 수치들이 실제 학습에서 나온 것임을 대조한다.</w:t>
+      </w:r>
     </w:p>
     <w:bookmarkEnd w:id="22"/>
-    <w:bookmarkStart w:id="23" w:name="함정-ii-백본-언더튜닝-두-번째-반전"/>
+    <w:bookmarkStart w:id="23" w:name="Xbb4bcca659df5ce802fcc42bc32c0c048602933"/>
     <w:p>
       <w:pPr>
         <w:pStyle w:val="Heading3"/>
@@ -4138,8 +4159,7 @@
     <w:tbl>
       <w:tblPr>
         <w:tblStyle w:val="Table"/>
-        <w:tblW w:type="pct" w:w="5000"/>
-        <w:tblLayout w:type="fixed"/>
+        <w:tblW w:type="auto" w:w="0"/>
         <w:tblLook w:firstRow="1" w:lastRow="0" w:firstColumn="0" w:lastColumn="0" w:noHBand="0" w:noVBand="0" w:val="0020"/>
       </w:tblPr>
       <w:tblGrid>
@@ -4182,7 +4202,7 @@
               <w:pStyle w:val="Compact"/>
             </w:pPr>
             <w:r>
-              <w:t xml:space="preserve">MERT (튜닝, tr)</w:t>
+              <w:t xml:space="preserve">MERT (동결-튜닝 헤드, tr)</w:t>
             </w:r>
           </w:p>
         </w:tc>
@@ -4447,35 +4467,45 @@
         <w:pStyle w:val="BodyText"/>
       </w:pPr>
       <w:r>
-        <w:t xml:space="preserve">이는</w:t>
-      </w:r>
-      <w:r>
-        <w:t xml:space="preserve"> </w:t>
-      </w:r>
-      <w:r>
-        <w:rPr>
-          <w:b/>
-          <w:bCs/>
-        </w:rPr>
-        <w:t xml:space="preserve">§4.1의 판정을 두 번째로 뒤집는다</w:t>
-      </w:r>
-      <w:r>
-        <w:t xml:space="preserve">.</w:t>
-      </w:r>
-      <w:r>
-        <w:t xml:space="preserve"> </w:t>
-      </w:r>
-      <w:r>
-        <w:t xml:space="preserve">“SVM이 전 구간 우세”</w:t>
-      </w:r>
-      <w:r>
-        <w:t xml:space="preserve">라는 결론 자체가 데이터가 아니라</w:t>
-      </w:r>
-      <w:r>
-        <w:t xml:space="preserve"> </w:t>
-      </w:r>
-      <w:r>
-        <w:t xml:space="preserve">백본 언더튜닝의 산물이었다. 과도한 주장을 막는 두 가지 단서가 있다. 첫째, 올바른 헤드는</w:t>
+        <w:t xml:space="preserve">여기서의 MERT는</w:t>
+      </w:r>
+      <w:r>
+        <w:t xml:space="preserve"> </w:t>
+      </w:r>
+      <w:r>
+        <w:rPr>
+          <w:b/>
+          <w:bCs/>
+        </w:rPr>
+        <w:t xml:space="preserve">동결 백본 위의 헤드</w:t>
+      </w:r>
+      <w:r>
+        <w:t xml:space="preserve">(linear/mlp256 탐색의 fold별 최적)로, §4.4 표 4.4의</w:t>
+      </w:r>
+      <w:r>
+        <w:t xml:space="preserve"> </w:t>
+      </w:r>
+      <w:r>
+        <w:t xml:space="preserve">"동결-튜닝" 열과 동일한 값이다. 이 지점에서 MERT는 20·50%에서 SVM을 근소하게 밑돈다. §4.4는</w:t>
+      </w:r>
+      <w:r>
+        <w:t xml:space="preserve"> </w:t>
+      </w:r>
+      <w:r>
+        <w:t xml:space="preserve">같은 튜닝 예산 스펙트럼을</w:t>
+      </w:r>
+      <w:r>
+        <w:t xml:space="preserve"> </w:t>
+      </w:r>
+      <w:r>
+        <w:rPr>
+          <w:b/>
+          <w:bCs/>
+        </w:rPr>
+        <w:t xml:space="preserve">층 가중 헤드</w:t>
+      </w:r>
+      <w:r>
+        <w:t xml:space="preserve">까지 확장하여 MERT의</w:t>
       </w:r>
       <w:r>
         <w:t xml:space="preserve"> </w:t>
@@ -4485,93 +4515,65 @@
           <w:i/>
           <w:iCs/>
         </w:rPr>
-        <w:t xml:space="preserve">예산</w:t>
+        <w:t xml:space="preserve">공정한 상한</w:t>
+      </w:r>
+      <w:r>
+        <w:t xml:space="preserve">을 제시하는데, 그</w:t>
+      </w:r>
+      <w:r>
+        <w:t xml:space="preserve"> </w:t>
+      </w:r>
+      <w:r>
+        <w:t xml:space="preserve">상한에서는 오히려 MERT가 SVM과 대등하거나 약간 앞선다(표 4.4). 즉 헤드 용량을 관행 수준으로</w:t>
+      </w:r>
+      <w:r>
+        <w:t xml:space="preserve"> </w:t>
+      </w:r>
+      <w:r>
+        <w:t xml:space="preserve">올릴수록 격차는 SVM 우세에서 무승부로 좁혀지며, 어느 지점에서도 ±0.7 fold 표준편차를 넘지 않는다.</w:t>
+      </w:r>
+    </w:p>
+    <w:p>
+      <w:pPr>
+        <w:pStyle w:val="BodyText"/>
+      </w:pPr>
+      <w:r>
+        <w:t xml:space="preserve">이는</w:t>
+      </w:r>
+      <w:r>
+        <w:t xml:space="preserve"> </w:t>
+      </w:r>
+      <w:r>
+        <w:rPr>
+          <w:b/>
+          <w:bCs/>
+        </w:rPr>
+        <w:t xml:space="preserve">§4.1의 판정을 두 번째로 뒤집는다</w:t>
+      </w:r>
+      <w:r>
+        <w:t xml:space="preserve">. "SVM이 전 구간 우세"라는 결론 자체가 데이터가 아니라</w:t>
+      </w:r>
+      <w:r>
+        <w:t xml:space="preserve"> </w:t>
+      </w:r>
+      <w:r>
+        <w:t xml:space="preserve">백본 언더튜닝의 산물이었다. 과도한 주장을 막는 두 가지 단서가 있다. 첫째, 올바른 헤드는</w:t>
+      </w:r>
+      <w:r>
+        <w:t xml:space="preserve"> </w:t>
       </w:r>
       <w:r>
         <w:rPr>
           <w:i/>
           <w:iCs/>
         </w:rPr>
-        <w:t xml:space="preserve"> </w:t>
+        <w:t xml:space="preserve">예산</w:t>
       </w:r>
       <w:r>
         <w:rPr>
           <w:i/>
           <w:iCs/>
         </w:rPr>
-        <w:t xml:space="preserve">의존적</w:t>
-      </w:r>
-      <w:r>
-        <w:t xml:space="preserve">이다. 라벨이 적을 때는 탐색이 단순 선형 헤드를 선호하고(5%: 12개 중 9개 fold가 linear;</w:t>
-      </w:r>
-      <w:r>
-        <w:t xml:space="preserve"> </w:t>
-      </w:r>
-      <w:r>
-        <w:t xml:space="preserve">10%: 8/12), 20%에서 반반이며, 50%에서만 mlp256을 선호한다. 교훈은</w:t>
-      </w:r>
-      <w:r>
-        <w:t xml:space="preserve"> </w:t>
-      </w:r>
-      <w:r>
-        <w:t xml:space="preserve">“관행이 SSL을 언더튜닝한다”</w:t>
-      </w:r>
-      <w:r>
-        <w:t xml:space="preserve">가</w:t>
-      </w:r>
-      <w:r>
-        <w:t xml:space="preserve"> </w:t>
-      </w:r>
-      <w:r>
-        <w:t xml:space="preserve">아니라</w:t>
-      </w:r>
-      <w:r>
-        <w:t xml:space="preserve"> </w:t>
-      </w:r>
-      <w:r>
-        <w:t xml:space="preserve">“프로브 설계가 결론을 뒤집을 수 있으며, 우리는 관행 이하에 머물러 한 번 스스로 속았다”</w:t>
-      </w:r>
-      <w:r>
-        <w:t xml:space="preserve">이다.</w:t>
-      </w:r>
-      <w:r>
-        <w:t xml:space="preserve"> </w:t>
-      </w:r>
-      <w:r>
-        <w:t xml:space="preserve">둘째, SVM에 구조적 이점 — 조기종료 분할이 불필요하여</w:t>
-      </w:r>
-      <w:r>
-        <w:t xml:space="preserve"> </w:t>
-      </w:r>
-      <w:r>
-        <w:rPr>
-          <w:rStyle w:val="VerbatimChar"/>
-        </w:rPr>
-        <w:t xml:space="preserve">seed_core</w:t>
-      </w:r>
-      <w:r>
-        <w:t xml:space="preserve"> </w:t>
-      </w:r>
-      <w:r>
-        <w:t xml:space="preserve">80% 전체로 학습 가능 — 을 허용하면</w:t>
-      </w:r>
-      <w:r>
-        <w:t xml:space="preserve"> </w:t>
-      </w:r>
-      <w:r>
-        <w:t xml:space="preserve">전 구간에서 앞서지만(10%에서 최대 −1.04σ), n=4에서 여전히 ~1σ 이내로, 반전이 아니라 기울기이다.</w:t>
-      </w:r>
-    </w:p>
-    <w:bookmarkEnd w:id="23"/>
-    <w:bookmarkStart w:id="24" w:name="함정-iii-불확실성-정량화의-재표집-단위-미수near-miss"/>
-    <w:p>
-      <w:pPr>
-        <w:pStyle w:val="Heading3"/>
-      </w:pPr>
-      <w:r>
-        <w:t xml:space="preserve">4.3 함정 (iii): 불확실성 정량화의 재표집 단위 —</w:t>
-      </w:r>
-      <w:r>
         <w:t xml:space="preserve"> </w:t>
       </w:r>
       <w:r>
@@ -4579,540 +4581,59 @@
           <w:i/>
           <w:iCs/>
         </w:rPr>
-        <w:t xml:space="preserve">미수(near-miss)</w:t>
-      </w:r>
-    </w:p>
-    <w:p>
-      <w:pPr>
-        <w:pStyle w:val="FirstParagraph"/>
-      </w:pPr>
-      <w:r>
-        <w:t xml:space="preserve">동급에 착지한 뒤, 이를 BCa 부트스트랩(B=2000)으로 정량화하였다. 네 악기 fold를 고정한 채</w:t>
-      </w:r>
-      <w:r>
-        <w:t xml:space="preserve"> </w:t>
-      </w:r>
-      <w:r>
-        <w:rPr>
-          <w:b/>
-          <w:bCs/>
-        </w:rPr>
-        <w:t xml:space="preserve">녹음</w:t>
-      </w:r>
-      <w:r>
-        <w:rPr>
-          <w:b/>
-          <w:bCs/>
-        </w:rPr>
-        <w:t xml:space="preserve"> </w:t>
-      </w:r>
-      <w:r>
-        <w:rPr>
-          <w:b/>
-          <w:bCs/>
-        </w:rPr>
-        <w:t xml:space="preserve">클러스터</w:t>
-      </w:r>
-      <w:r>
-        <w:t xml:space="preserve"> </w:t>
-      </w:r>
-      <w:r>
-        <w:t xml:space="preserve">단위로 재표집하면, 대응 MERT−SVM 구간이</w:t>
-      </w:r>
-      <w:r>
-        <w:t xml:space="preserve"> </w:t>
-      </w:r>
-      <w:r>
-        <w:rPr>
-          <w:b/>
-          <w:bCs/>
-        </w:rPr>
-        <w:t xml:space="preserve">5%와 20% 예산에서 0을 배제</w:t>
-      </w:r>
-      <w:r>
-        <w:t xml:space="preserve">하여(−0.027</w:t>
-      </w:r>
-      <w:r>
-        <w:t xml:space="preserve"> </w:t>
-      </w:r>
-      <w:r>
-        <w:t xml:space="preserve">[−0.044, −0.012], −0.026 [−0.043, −0.011])</w:t>
-      </w:r>
-      <w:r>
-        <w:t xml:space="preserve"> </w:t>
-      </w:r>
-      <w:r>
-        <w:t xml:space="preserve">“SVM이 유의하게 앞선다”</w:t>
-      </w:r>
-      <w:r>
-        <w:t xml:space="preserve">로 읽히며, §4.2의 동급과 충돌한다.</w:t>
-      </w:r>
-      <w:r>
-        <w:t xml:space="preserve"> </w:t>
-      </w:r>
-      <w:r>
-        <w:t xml:space="preserve">그러나 이 구간은 테스트 클립 표집 분산만 담는다. 우리 LOSO 주장이 일반화하는 축인 fold가 고정되어</w:t>
-      </w:r>
-      <w:r>
-        <w:t xml:space="preserve"> </w:t>
-      </w:r>
-      <w:r>
-        <w:t xml:space="preserve">있다. 악기를 가로지르는 일반화 주장은 악기/fold 단위로 재표집해야 한다. 그렇게 하면(2수준 부트스트랩)</w:t>
-      </w:r>
-      <w:r>
-        <w:t xml:space="preserve"> </w:t>
-      </w:r>
-      <w:r>
-        <w:t xml:space="preserve">구간이</w:t>
-      </w:r>
-      <w:r>
-        <w:t xml:space="preserve"> </w:t>
-      </w:r>
-      <w:r>
-        <w:rPr>
-          <w:b/>
-          <w:bCs/>
-        </w:rPr>
-        <w:t xml:space="preserve">2.6~5.0배</w:t>
-      </w:r>
-      <w:r>
-        <w:t xml:space="preserve"> </w:t>
-      </w:r>
-      <w:r>
-        <w:t xml:space="preserve">넓어지고, 모든 대응 구간이 이제</w:t>
-      </w:r>
-      <w:r>
-        <w:t xml:space="preserve"> </w:t>
-      </w:r>
-      <w:r>
-        <w:rPr>
-          <w:b/>
-          <w:bCs/>
-        </w:rPr>
-        <w:t xml:space="preserve">0을 포함한다</w:t>
-      </w:r>
-      <w:r>
-        <w:t xml:space="preserve">(표 4.3):</w:t>
-      </w:r>
-    </w:p>
-    <w:tbl>
-      <w:tblPr>
-        <w:tblStyle w:val="Table"/>
-        <w:tblW w:type="pct" w:w="5000"/>
-        <w:tblLayout w:type="fixed"/>
-        <w:tblLook w:firstRow="1" w:lastRow="0" w:firstColumn="0" w:lastColumn="0" w:noHBand="0" w:noVBand="0" w:val="0020"/>
-      </w:tblPr>
-      <w:tblGrid>
-        <w:gridCol w:w="1320"/>
-        <w:gridCol w:w="1320"/>
-        <w:gridCol w:w="1320"/>
-        <w:gridCol w:w="1320"/>
-        <w:gridCol w:w="1320"/>
-        <w:gridCol w:w="1320"/>
-      </w:tblGrid>
-      <w:tr>
-        <w:trPr>
-          <w:tblHeader w:val="on"/>
-        </w:trPr>
-        <w:tc>
-          <w:tcPr/>
-          <w:p>
-            <w:pPr>
-              <w:pStyle w:val="Compact"/>
-            </w:pPr>
-            <w:r>
-              <w:t xml:space="preserve">라벨 예산</w:t>
-            </w:r>
-          </w:p>
-        </w:tc>
-        <w:tc>
-          <w:tcPr/>
-          <w:p>
-            <w:pPr>
-              <w:pStyle w:val="Compact"/>
-            </w:pPr>
-            <w:r>
-              <w:t xml:space="preserve">MERT − SVM</w:t>
-            </w:r>
-          </w:p>
-        </w:tc>
-        <w:tc>
-          <w:tcPr/>
-          <w:p>
-            <w:pPr>
-              <w:pStyle w:val="Compact"/>
-            </w:pPr>
-            <w:r>
-              <w:t xml:space="preserve">1수준 CI (클립)</w:t>
-            </w:r>
-          </w:p>
-        </w:tc>
-        <w:tc>
-          <w:tcPr/>
-          <w:p>
-            <w:pPr>
-              <w:pStyle w:val="Compact"/>
-            </w:pPr>
-            <w:r>
-              <w:t xml:space="preserve">0 포함</w:t>
-            </w:r>
-          </w:p>
-        </w:tc>
-        <w:tc>
-          <w:tcPr/>
-          <w:p>
-            <w:pPr>
-              <w:pStyle w:val="Compact"/>
-            </w:pPr>
-            <w:r>
-              <w:t xml:space="preserve">2수준 CI (fold)</w:t>
-            </w:r>
-          </w:p>
-        </w:tc>
-        <w:tc>
-          <w:tcPr/>
-          <w:p>
-            <w:pPr>
-              <w:pStyle w:val="Compact"/>
-            </w:pPr>
-            <w:r>
-              <w:t xml:space="preserve">0 포함</w:t>
-            </w:r>
-          </w:p>
-        </w:tc>
-      </w:tr>
-      <w:tr>
-        <w:tc>
-          <w:tcPr/>
-          <w:p>
-            <w:pPr>
-              <w:pStyle w:val="Compact"/>
-            </w:pPr>
-            <w:r>
-              <w:t xml:space="preserve">5%</w:t>
-            </w:r>
-          </w:p>
-        </w:tc>
-        <w:tc>
-          <w:tcPr/>
-          <w:p>
-            <w:pPr>
-              <w:pStyle w:val="Compact"/>
-            </w:pPr>
-            <w:r>
-              <w:t xml:space="preserve">−0.027</w:t>
-            </w:r>
-          </w:p>
-        </w:tc>
-        <w:tc>
-          <w:tcPr/>
-          <w:p>
-            <w:pPr>
-              <w:pStyle w:val="Compact"/>
-            </w:pPr>
-            <w:r>
-              <w:t xml:space="preserve">[−0.044, −0.012]</w:t>
-            </w:r>
-          </w:p>
-        </w:tc>
-        <w:tc>
-          <w:tcPr/>
-          <w:p>
-            <w:pPr>
-              <w:pStyle w:val="Compact"/>
-            </w:pPr>
-            <w:r>
-              <w:t xml:space="preserve">아니오</w:t>
-            </w:r>
-          </w:p>
-        </w:tc>
-        <w:tc>
-          <w:tcPr/>
-          <w:p>
-            <w:pPr>
-              <w:pStyle w:val="Compact"/>
-            </w:pPr>
-            <w:r>
-              <w:t xml:space="preserve">[−0.107, +0.050]</w:t>
-            </w:r>
-          </w:p>
-        </w:tc>
-        <w:tc>
-          <w:tcPr/>
-          <w:p>
-            <w:pPr>
-              <w:pStyle w:val="Compact"/>
-            </w:pPr>
-            <w:r>
-              <w:rPr>
-                <w:b/>
-                <w:bCs/>
-              </w:rPr>
-              <w:t xml:space="preserve">예</w:t>
-            </w:r>
-          </w:p>
-        </w:tc>
-      </w:tr>
-      <w:tr>
-        <w:tc>
-          <w:tcPr/>
-          <w:p>
-            <w:pPr>
-              <w:pStyle w:val="Compact"/>
-            </w:pPr>
-            <w:r>
-              <w:t xml:space="preserve">10%</w:t>
-            </w:r>
-          </w:p>
-        </w:tc>
-        <w:tc>
-          <w:tcPr/>
-          <w:p>
-            <w:pPr>
-              <w:pStyle w:val="Compact"/>
-            </w:pPr>
-            <w:r>
-              <w:t xml:space="preserve">−0.000</w:t>
-            </w:r>
-          </w:p>
-        </w:tc>
-        <w:tc>
-          <w:tcPr/>
-          <w:p>
-            <w:pPr>
-              <w:pStyle w:val="Compact"/>
-            </w:pPr>
-            <w:r>
-              <w:t xml:space="preserve">[−0.016, +0.015]</w:t>
-            </w:r>
-          </w:p>
-        </w:tc>
-        <w:tc>
-          <w:tcPr/>
-          <w:p>
-            <w:pPr>
-              <w:pStyle w:val="Compact"/>
-            </w:pPr>
-            <w:r>
-              <w:t xml:space="preserve">예</w:t>
-            </w:r>
-          </w:p>
-        </w:tc>
-        <w:tc>
-          <w:tcPr/>
-          <w:p>
-            <w:pPr>
-              <w:pStyle w:val="Compact"/>
-            </w:pPr>
-            <w:r>
-              <w:t xml:space="preserve">[−0.071, +0.069]</w:t>
-            </w:r>
-          </w:p>
-        </w:tc>
-        <w:tc>
-          <w:tcPr/>
-          <w:p>
-            <w:pPr>
-              <w:pStyle w:val="Compact"/>
-            </w:pPr>
-            <w:r>
-              <w:rPr>
-                <w:b/>
-                <w:bCs/>
-              </w:rPr>
-              <w:t xml:space="preserve">예</w:t>
-            </w:r>
-          </w:p>
-        </w:tc>
-      </w:tr>
-      <w:tr>
-        <w:tc>
-          <w:tcPr/>
-          <w:p>
-            <w:pPr>
-              <w:pStyle w:val="Compact"/>
-            </w:pPr>
-            <w:r>
-              <w:t xml:space="preserve">20%</w:t>
-            </w:r>
-          </w:p>
-        </w:tc>
-        <w:tc>
-          <w:tcPr/>
-          <w:p>
-            <w:pPr>
-              <w:pStyle w:val="Compact"/>
-            </w:pPr>
-            <w:r>
-              <w:t xml:space="preserve">−0.026</w:t>
-            </w:r>
-          </w:p>
-        </w:tc>
-        <w:tc>
-          <w:tcPr/>
-          <w:p>
-            <w:pPr>
-              <w:pStyle w:val="Compact"/>
-            </w:pPr>
-            <w:r>
-              <w:t xml:space="preserve">[−0.043, −0.011]</w:t>
-            </w:r>
-          </w:p>
-        </w:tc>
-        <w:tc>
-          <w:tcPr/>
-          <w:p>
-            <w:pPr>
-              <w:pStyle w:val="Compact"/>
-            </w:pPr>
-            <w:r>
-              <w:t xml:space="preserve">아니오</w:t>
-            </w:r>
-          </w:p>
-        </w:tc>
-        <w:tc>
-          <w:tcPr/>
-          <w:p>
-            <w:pPr>
-              <w:pStyle w:val="Compact"/>
-            </w:pPr>
-            <w:r>
-              <w:t xml:space="preserve">[−0.074, +0.035]</w:t>
-            </w:r>
-          </w:p>
-        </w:tc>
-        <w:tc>
-          <w:tcPr/>
-          <w:p>
-            <w:pPr>
-              <w:pStyle w:val="Compact"/>
-            </w:pPr>
-            <w:r>
-              <w:rPr>
-                <w:b/>
-                <w:bCs/>
-              </w:rPr>
-              <w:t xml:space="preserve">예</w:t>
-            </w:r>
-          </w:p>
-        </w:tc>
-      </w:tr>
-      <w:tr>
-        <w:tc>
-          <w:tcPr/>
-          <w:p>
-            <w:pPr>
-              <w:pStyle w:val="Compact"/>
-            </w:pPr>
-            <w:r>
-              <w:t xml:space="preserve">50%</w:t>
-            </w:r>
-          </w:p>
-        </w:tc>
-        <w:tc>
-          <w:tcPr/>
-          <w:p>
-            <w:pPr>
-              <w:pStyle w:val="Compact"/>
-            </w:pPr>
-            <w:r>
-              <w:t xml:space="preserve">−0.007</w:t>
-            </w:r>
-          </w:p>
-        </w:tc>
-        <w:tc>
-          <w:tcPr/>
-          <w:p>
-            <w:pPr>
-              <w:pStyle w:val="Compact"/>
-            </w:pPr>
-            <w:r>
-              <w:t xml:space="preserve">[−0.021, +0.006]</w:t>
-            </w:r>
-          </w:p>
-        </w:tc>
-        <w:tc>
-          <w:tcPr/>
-          <w:p>
-            <w:pPr>
-              <w:pStyle w:val="Compact"/>
-            </w:pPr>
-            <w:r>
-              <w:t xml:space="preserve">예</w:t>
-            </w:r>
-          </w:p>
-        </w:tc>
-        <w:tc>
-          <w:tcPr/>
-          <w:p>
-            <w:pPr>
-              <w:pStyle w:val="Compact"/>
-            </w:pPr>
-            <w:r>
-              <w:t xml:space="preserve">[−0.046, +0.025]</w:t>
-            </w:r>
-          </w:p>
-        </w:tc>
-        <w:tc>
-          <w:tcPr/>
-          <w:p>
-            <w:pPr>
-              <w:pStyle w:val="Compact"/>
-            </w:pPr>
-            <w:r>
-              <w:rPr>
-                <w:b/>
-                <w:bCs/>
-              </w:rPr>
-              <w:t xml:space="preserve">예</w:t>
-            </w:r>
-          </w:p>
-        </w:tc>
-      </w:tr>
-    </w:tbl>
-    <w:p>
-      <w:pPr>
-        <w:pStyle w:val="BodyText"/>
-      </w:pPr>
-      <w:r>
-        <w:t xml:space="preserve">클립 단위 구간을 보고했다면 결론을</w:t>
-      </w:r>
-      <w:r>
-        <w:t xml:space="preserve"> </w:t>
-      </w:r>
-      <w:r>
-        <w:rPr>
-          <w:b/>
-          <w:bCs/>
-        </w:rPr>
-        <w:t xml:space="preserve">세 번째로</w:t>
-      </w:r>
-      <w:r>
-        <w:t xml:space="preserve"> </w:t>
-      </w:r>
-      <w:r>
-        <w:t xml:space="preserve">— 다시</w:t>
-      </w:r>
-      <w:r>
-        <w:t xml:space="preserve"> </w:t>
-      </w:r>
-      <w:r>
-        <w:t xml:space="preserve">“SVM 유의 우세”</w:t>
-      </w:r>
-      <w:r>
-        <w:t xml:space="preserve">로 — 뒤집었을 것이다.</w:t>
-      </w:r>
-      <w:r>
-        <w:t xml:space="preserve"> </w:t>
-      </w:r>
-      <w:r>
-        <w:t xml:space="preserve">함정 (i), (ii)와 달리 이 함정은 어떤 보고된 결과에도 진입하지 않았다. 출판 전에 포착했기 때문이다.</w:t>
-      </w:r>
-      <w:r>
-        <w:t xml:space="preserve"> </w:t>
-      </w:r>
-      <w:r>
-        <w:t xml:space="preserve">이 함정을 특별히 표시하는 이유는 포착이</w:t>
+        <w:t xml:space="preserve">의존적</w:t>
+      </w:r>
+      <w:r>
+        <w:t xml:space="preserve">이다. 라벨이 적을 때는 탐색이 단순 선형 헤드를 선호하고(5%: 12개 중 9개 fold가 linear;</w:t>
+      </w:r>
+      <w:r>
+        <w:t xml:space="preserve"> </w:t>
+      </w:r>
+      <w:r>
+        <w:t xml:space="preserve">10%: 8/12), 20%에서 반반이며, 50%에서만 mlp256을 선호한다. 교훈은 "관행이 SSL을 언더튜닝한다"가</w:t>
+      </w:r>
+      <w:r>
+        <w:t xml:space="preserve"> </w:t>
+      </w:r>
+      <w:r>
+        <w:t xml:space="preserve">아니라 "프로브 설계가 결론을 뒤집을 수 있으며, 우리는 관행 이하에 머물러 한 번 스스로 속았다"이다.</w:t>
+      </w:r>
+      <w:r>
+        <w:t xml:space="preserve"> </w:t>
+      </w:r>
+      <w:r>
+        <w:t xml:space="preserve">둘째, SVM에 구조적 이점 — 조기종료 분할이 불필요하여</w:t>
+      </w:r>
+      <w:r>
+        <w:t xml:space="preserve"> </w:t>
+      </w:r>
+      <w:r>
+        <w:rPr>
+          <w:rStyle w:val="VerbatimChar"/>
+        </w:rPr>
+        <w:t xml:space="preserve">seed_core</w:t>
+      </w:r>
+      <w:r>
+        <w:t xml:space="preserve"> </w:t>
+      </w:r>
+      <w:r>
+        <w:t xml:space="preserve">80% 전체로 학습 가능 — 을 허용하면</w:t>
+      </w:r>
+      <w:r>
+        <w:t xml:space="preserve"> </w:t>
+      </w:r>
+      <w:r>
+        <w:t xml:space="preserve">전 구간에서 앞서지만(10%에서 최대 −1.04σ), n=4에서 여전히 ~1σ 이내로, 반전이 아니라 기울기이다.</w:t>
+      </w:r>
+    </w:p>
+    <w:bookmarkEnd w:id="23"/>
+    <w:bookmarkStart w:id="24" w:name="X93b196ee6b27bd0bbd98b04d77016db10624e65"/>
+    <w:p>
+      <w:pPr>
+        <w:pStyle w:val="Heading3"/>
+      </w:pPr>
+      <w:r>
+        <w:t xml:space="preserve">4.3 함정 (iii): 불확실성 정량화의 재표집 단위 —</w:t>
       </w:r>
       <w:r>
         <w:t xml:space="preserve"> </w:t>
@@ -5122,38 +4643,7 @@
           <w:i/>
           <w:iCs/>
         </w:rPr>
-        <w:t xml:space="preserve">더 어렵기</w:t>
-      </w:r>
-      <w:r>
-        <w:t xml:space="preserve"> </w:t>
-      </w:r>
-      <w:r>
-        <w:t xml:space="preserve">때문이다. 더 엄밀한 방법(클러스터 부트스트랩)을</w:t>
-      </w:r>
-      <w:r>
-        <w:t xml:space="preserve"> </w:t>
-      </w:r>
-      <w:r>
-        <w:t xml:space="preserve">도입하면서 한 수준 얕게 멈추는 데서 발생한다. fold 단위의 넓은 구간(n=4 악기)은 숨길 약점이 아니라</w:t>
-      </w:r>
-      <w:r>
-        <w:t xml:space="preserve"> </w:t>
-      </w:r>
-      <w:r>
-        <w:t xml:space="preserve">“다른 악기에서도 유지되는가”</w:t>
-      </w:r>
-      <w:r>
-        <w:t xml:space="preserve">에 대한 정직한 답이다.</w:t>
-      </w:r>
-    </w:p>
-    <w:bookmarkEnd w:id="24"/>
-    <w:bookmarkStart w:id="25" w:name="착지-조건부-동급"/>
-    <w:p>
-      <w:pPr>
-        <w:pStyle w:val="Heading3"/>
-      </w:pPr>
-      <w:r>
-        <w:t xml:space="preserve">4.4 착지: 조건부 동급</w:t>
+        <w:t xml:space="preserve">미수(near-miss)</w:t>
       </w:r>
     </w:p>
     <w:p>
@@ -5161,121 +4651,103 @@
         <w:pStyle w:val="FirstParagraph"/>
       </w:pPr>
       <w:r>
-        <w:t xml:space="preserve">세 함정을 모두 제거하면, 교정된 그림은</w:t>
-      </w:r>
-      <w:r>
-        <w:t xml:space="preserve"> </w:t>
-      </w:r>
-      <w:r>
-        <w:rPr>
-          <w:b/>
-          <w:bCs/>
-        </w:rPr>
-        <w:t xml:space="preserve">조건부 동급</w:t>
-      </w:r>
-      <w:r>
-        <w:t xml:space="preserve">이다. 튜닝된 245차원 SVM과 튜닝된 MERT</w:t>
-      </w:r>
-      <w:r>
-        <w:t xml:space="preserve"> </w:t>
-      </w:r>
-      <w:r>
-        <w:t xml:space="preserve">헤드는 5~50% 라벨 예산 전 구간에서 통계적으로 구분되지 않는다(모든 격차 ±0.7 fold 표준편차 이내,</w:t>
-      </w:r>
-      <w:r>
-        <w:t xml:space="preserve"> </w:t>
-      </w:r>
-      <w:r>
-        <w:t xml:space="preserve">§4.2; 모든 fold 단위 구간이 0을 포함, §4.3). SVM이 단지 클립 길이 차이를 이용하는 것 아니냐는</w:t>
-      </w:r>
-      <w:r>
-        <w:t xml:space="preserve"> </w:t>
-      </w:r>
-      <w:r>
-        <w:t xml:space="preserve">길이 confound는 길이 전용 기준선(단일 길이 특징)으로 배제한다. 이 기준선은 LOSO에서 macro-F1</w:t>
-      </w:r>
-      <w:r>
-        <w:t xml:space="preserve"> </w:t>
-      </w:r>
-      <w:r>
-        <w:t xml:space="preserve">0.400에 그치는 반면 전체 245차원 특징은 0.906이다(격차 0.506). 나아가 특징에서 길이 성분을 회귀로</w:t>
-      </w:r>
-      <w:r>
-        <w:t xml:space="preserve"> </w:t>
-      </w:r>
-      <w:r>
-        <w:t xml:space="preserve">제거해도 성능은 거의 유지되고(0.906 → 0.893), 온셋 계열 특징은 잔차화 후 오히려</w:t>
-      </w:r>
-      <w:r>
-        <w:t xml:space="preserve"> </w:t>
-      </w:r>
-      <w:r>
-        <w:rPr>
-          <w:i/>
-          <w:iCs/>
-        </w:rPr>
-        <w:t xml:space="preserve">상승</w:t>
-      </w:r>
-      <w:r>
-        <w:t xml:space="preserve">한다(0.673</w:t>
-      </w:r>
-      <w:r>
-        <w:t xml:space="preserve"> </w:t>
-      </w:r>
-      <w:r>
-        <w:t xml:space="preserve">→ 0.694). 단순한 길이 프록시였다면 붕괴했어야 한다.</w:t>
-      </w:r>
-    </w:p>
-    <w:p>
-      <w:pPr>
-        <w:pStyle w:val="BodyText"/>
-      </w:pPr>
-      <w:r>
-        <w:rPr>
-          <w:b/>
-          <w:bCs/>
-        </w:rPr>
-        <w:t xml:space="preserve">더 큰 튜닝 예산이 백본을 구제하는가?</w:t>
-      </w:r>
-      <w:r>
-        <w:t xml:space="preserve"> </w:t>
-      </w:r>
-      <w:r>
-        <w:t xml:space="preserve">§4.2에 대한 자연스러운 반론은, 우리가</w:t>
-      </w:r>
-      <w:r>
-        <w:t xml:space="preserve"> </w:t>
-      </w:r>
-      <w:r>
-        <w:rPr>
-          <w:i/>
-          <w:iCs/>
-        </w:rPr>
-        <w:t xml:space="preserve">동결된</w:t>
-      </w:r>
-      <w:r>
-        <w:t xml:space="preserve"> </w:t>
-      </w:r>
-      <w:r>
-        <w:t xml:space="preserve">헤드만</w:t>
-      </w:r>
-      <w:r>
-        <w:t xml:space="preserve"> </w:t>
-      </w:r>
-      <w:r>
-        <w:t xml:space="preserve">튜닝했으므로 백본 자체를 적응시키면 MERT에 격차가 열릴 수 있다는 것이다. 그렇지 않다. 오히려</w:t>
-      </w:r>
-      <w:r>
-        <w:t xml:space="preserve"> </w:t>
-      </w:r>
-      <w:r>
-        <w:t xml:space="preserve">반대이다. 우리는 단일 튜닝 예산 스펙트럼 위에 다섯 지점을 놓는다(표 4.4): SVM → 동결-선형 헤드 →</w:t>
-      </w:r>
-      <w:r>
-        <w:t xml:space="preserve"> </w:t>
-      </w:r>
-      <w:r>
-        <w:t xml:space="preserve">동결-튜닝 헤드 → 학습된 층 가중 → 백본에 대한 LoRA 적응(r=8, q/v 투영).</w:t>
+        <w:t xml:space="preserve">동급에 착지한 뒤, 이를 BCa 부트스트랩(B=2000)으로 정량화하였다. 네 악기 fold를 고정한 채</w:t>
+      </w:r>
+      <w:r>
+        <w:t xml:space="preserve"> </w:t>
+      </w:r>
+      <w:r>
+        <w:rPr>
+          <w:b/>
+          <w:bCs/>
+        </w:rPr>
+        <w:t xml:space="preserve">녹음</w:t>
+      </w:r>
+      <w:r>
+        <w:rPr>
+          <w:b/>
+          <w:bCs/>
+        </w:rPr>
+        <w:t xml:space="preserve"> </w:t>
+      </w:r>
+      <w:r>
+        <w:rPr>
+          <w:b/>
+          <w:bCs/>
+        </w:rPr>
+        <w:t xml:space="preserve">클러스터</w:t>
+      </w:r>
+      <w:r>
+        <w:t xml:space="preserve"> </w:t>
+      </w:r>
+      <w:r>
+        <w:t xml:space="preserve">단위로 재표집하면, 대응 MERT−SVM 구간이</w:t>
+      </w:r>
+      <w:r>
+        <w:t xml:space="preserve"> </w:t>
+      </w:r>
+      <w:r>
+        <w:rPr>
+          <w:b/>
+          <w:bCs/>
+        </w:rPr>
+        <w:t xml:space="preserve">5%와 20% 예산에서 0을 배제</w:t>
+      </w:r>
+      <w:r>
+        <w:t xml:space="preserve">하여(−0.027</w:t>
+      </w:r>
+      <w:r>
+        <w:t xml:space="preserve"> </w:t>
+      </w:r>
+      <w:r>
+        <w:t xml:space="preserve">[−0.044, −0.012], −0.026 [−0.043, −0.011]) "SVM이 유의하게 앞선다"로 읽히며, §4.2의 동급과 충돌한다.</w:t>
+      </w:r>
+      <w:r>
+        <w:t xml:space="preserve"> </w:t>
+      </w:r>
+      <w:r>
+        <w:t xml:space="preserve">그러나 이 구간은 테스트 클립 표집 분산만 담는다. 우리 LOSO 주장이 일반화하는 축인 fold가 고정되어</w:t>
+      </w:r>
+      <w:r>
+        <w:t xml:space="preserve"> </w:t>
+      </w:r>
+      <w:r>
+        <w:t xml:space="preserve">있다. 악기를 가로지르는 일반화 주장은 악기/fold 단위로 재표집해야 한다. 그렇게 하면(2수준 부트스트랩)</w:t>
+      </w:r>
+      <w:r>
+        <w:t xml:space="preserve"> </w:t>
+      </w:r>
+      <w:r>
+        <w:t xml:space="preserve">구간이</w:t>
+      </w:r>
+      <w:r>
+        <w:t xml:space="preserve"> </w:t>
+      </w:r>
+      <w:r>
+        <w:rPr>
+          <w:b/>
+          <w:bCs/>
+        </w:rPr>
+        <w:t xml:space="preserve">2.6~5.0배</w:t>
+      </w:r>
+      <w:r>
+        <w:t xml:space="preserve"> </w:t>
+      </w:r>
+      <w:r>
+        <w:t xml:space="preserve">넓어지고, 모든 대응 구간이 이제</w:t>
+      </w:r>
+      <w:r>
+        <w:t xml:space="preserve"> </w:t>
+      </w:r>
+      <w:r>
+        <w:rPr>
+          <w:b/>
+          <w:bCs/>
+        </w:rPr>
+        <w:t xml:space="preserve">0을 포함한다</w:t>
+      </w:r>
+      <w:r>
+        <w:t xml:space="preserve">(표 4.3):</w:t>
       </w:r>
     </w:p>
     <w:tbl>
@@ -5303,6 +4775,576 @@
               <w:pStyle w:val="Compact"/>
             </w:pPr>
             <w:r>
+              <w:t xml:space="preserve">라벨 예산</w:t>
+            </w:r>
+          </w:p>
+        </w:tc>
+        <w:tc>
+          <w:tcPr/>
+          <w:p>
+            <w:pPr>
+              <w:pStyle w:val="Compact"/>
+            </w:pPr>
+            <w:r>
+              <w:t xml:space="preserve">MERT − SVM</w:t>
+            </w:r>
+          </w:p>
+        </w:tc>
+        <w:tc>
+          <w:tcPr/>
+          <w:p>
+            <w:pPr>
+              <w:pStyle w:val="Compact"/>
+            </w:pPr>
+            <w:r>
+              <w:t xml:space="preserve">1수준 CI (클립)</w:t>
+            </w:r>
+          </w:p>
+        </w:tc>
+        <w:tc>
+          <w:tcPr/>
+          <w:p>
+            <w:pPr>
+              <w:pStyle w:val="Compact"/>
+            </w:pPr>
+            <w:r>
+              <w:t xml:space="preserve">0 포함</w:t>
+            </w:r>
+          </w:p>
+        </w:tc>
+        <w:tc>
+          <w:tcPr/>
+          <w:p>
+            <w:pPr>
+              <w:pStyle w:val="Compact"/>
+            </w:pPr>
+            <w:r>
+              <w:t xml:space="preserve">2수준 CI (fold)</w:t>
+            </w:r>
+          </w:p>
+        </w:tc>
+        <w:tc>
+          <w:tcPr/>
+          <w:p>
+            <w:pPr>
+              <w:pStyle w:val="Compact"/>
+            </w:pPr>
+            <w:r>
+              <w:t xml:space="preserve">0 포함</w:t>
+            </w:r>
+          </w:p>
+        </w:tc>
+      </w:tr>
+      <w:tr>
+        <w:tc>
+          <w:tcPr/>
+          <w:p>
+            <w:pPr>
+              <w:pStyle w:val="Compact"/>
+            </w:pPr>
+            <w:r>
+              <w:t xml:space="preserve">5%</w:t>
+            </w:r>
+          </w:p>
+        </w:tc>
+        <w:tc>
+          <w:tcPr/>
+          <w:p>
+            <w:pPr>
+              <w:pStyle w:val="Compact"/>
+            </w:pPr>
+            <w:r>
+              <w:t xml:space="preserve">−0.027</w:t>
+            </w:r>
+          </w:p>
+        </w:tc>
+        <w:tc>
+          <w:tcPr/>
+          <w:p>
+            <w:pPr>
+              <w:pStyle w:val="Compact"/>
+            </w:pPr>
+            <w:r>
+              <w:t xml:space="preserve">[−0.044, −0.012]</w:t>
+            </w:r>
+          </w:p>
+        </w:tc>
+        <w:tc>
+          <w:tcPr/>
+          <w:p>
+            <w:pPr>
+              <w:pStyle w:val="Compact"/>
+            </w:pPr>
+            <w:r>
+              <w:t xml:space="preserve">아니오</w:t>
+            </w:r>
+          </w:p>
+        </w:tc>
+        <w:tc>
+          <w:tcPr/>
+          <w:p>
+            <w:pPr>
+              <w:pStyle w:val="Compact"/>
+            </w:pPr>
+            <w:r>
+              <w:t xml:space="preserve">[−0.107, +0.050]</w:t>
+            </w:r>
+          </w:p>
+        </w:tc>
+        <w:tc>
+          <w:tcPr/>
+          <w:p>
+            <w:pPr>
+              <w:pStyle w:val="Compact"/>
+            </w:pPr>
+            <w:r>
+              <w:rPr>
+                <w:b/>
+                <w:bCs/>
+              </w:rPr>
+              <w:t xml:space="preserve">예</w:t>
+            </w:r>
+          </w:p>
+        </w:tc>
+      </w:tr>
+      <w:tr>
+        <w:tc>
+          <w:tcPr/>
+          <w:p>
+            <w:pPr>
+              <w:pStyle w:val="Compact"/>
+            </w:pPr>
+            <w:r>
+              <w:t xml:space="preserve">10%</w:t>
+            </w:r>
+          </w:p>
+        </w:tc>
+        <w:tc>
+          <w:tcPr/>
+          <w:p>
+            <w:pPr>
+              <w:pStyle w:val="Compact"/>
+            </w:pPr>
+            <w:r>
+              <w:t xml:space="preserve">−0.000</w:t>
+            </w:r>
+          </w:p>
+        </w:tc>
+        <w:tc>
+          <w:tcPr/>
+          <w:p>
+            <w:pPr>
+              <w:pStyle w:val="Compact"/>
+            </w:pPr>
+            <w:r>
+              <w:t xml:space="preserve">[−0.016, +0.015]</w:t>
+            </w:r>
+          </w:p>
+        </w:tc>
+        <w:tc>
+          <w:tcPr/>
+          <w:p>
+            <w:pPr>
+              <w:pStyle w:val="Compact"/>
+            </w:pPr>
+            <w:r>
+              <w:t xml:space="preserve">예</w:t>
+            </w:r>
+          </w:p>
+        </w:tc>
+        <w:tc>
+          <w:tcPr/>
+          <w:p>
+            <w:pPr>
+              <w:pStyle w:val="Compact"/>
+            </w:pPr>
+            <w:r>
+              <w:t xml:space="preserve">[−0.071, +0.069]</w:t>
+            </w:r>
+          </w:p>
+        </w:tc>
+        <w:tc>
+          <w:tcPr/>
+          <w:p>
+            <w:pPr>
+              <w:pStyle w:val="Compact"/>
+            </w:pPr>
+            <w:r>
+              <w:rPr>
+                <w:b/>
+                <w:bCs/>
+              </w:rPr>
+              <w:t xml:space="preserve">예</w:t>
+            </w:r>
+          </w:p>
+        </w:tc>
+      </w:tr>
+      <w:tr>
+        <w:tc>
+          <w:tcPr/>
+          <w:p>
+            <w:pPr>
+              <w:pStyle w:val="Compact"/>
+            </w:pPr>
+            <w:r>
+              <w:t xml:space="preserve">20%</w:t>
+            </w:r>
+          </w:p>
+        </w:tc>
+        <w:tc>
+          <w:tcPr/>
+          <w:p>
+            <w:pPr>
+              <w:pStyle w:val="Compact"/>
+            </w:pPr>
+            <w:r>
+              <w:t xml:space="preserve">−0.026</w:t>
+            </w:r>
+          </w:p>
+        </w:tc>
+        <w:tc>
+          <w:tcPr/>
+          <w:p>
+            <w:pPr>
+              <w:pStyle w:val="Compact"/>
+            </w:pPr>
+            <w:r>
+              <w:t xml:space="preserve">[−0.043, −0.011]</w:t>
+            </w:r>
+          </w:p>
+        </w:tc>
+        <w:tc>
+          <w:tcPr/>
+          <w:p>
+            <w:pPr>
+              <w:pStyle w:val="Compact"/>
+            </w:pPr>
+            <w:r>
+              <w:t xml:space="preserve">아니오</w:t>
+            </w:r>
+          </w:p>
+        </w:tc>
+        <w:tc>
+          <w:tcPr/>
+          <w:p>
+            <w:pPr>
+              <w:pStyle w:val="Compact"/>
+            </w:pPr>
+            <w:r>
+              <w:t xml:space="preserve">[−0.074, +0.035]</w:t>
+            </w:r>
+          </w:p>
+        </w:tc>
+        <w:tc>
+          <w:tcPr/>
+          <w:p>
+            <w:pPr>
+              <w:pStyle w:val="Compact"/>
+            </w:pPr>
+            <w:r>
+              <w:rPr>
+                <w:b/>
+                <w:bCs/>
+              </w:rPr>
+              <w:t xml:space="preserve">예</w:t>
+            </w:r>
+          </w:p>
+        </w:tc>
+      </w:tr>
+      <w:tr>
+        <w:tc>
+          <w:tcPr/>
+          <w:p>
+            <w:pPr>
+              <w:pStyle w:val="Compact"/>
+            </w:pPr>
+            <w:r>
+              <w:t xml:space="preserve">50%</w:t>
+            </w:r>
+          </w:p>
+        </w:tc>
+        <w:tc>
+          <w:tcPr/>
+          <w:p>
+            <w:pPr>
+              <w:pStyle w:val="Compact"/>
+            </w:pPr>
+            <w:r>
+              <w:t xml:space="preserve">−0.007</w:t>
+            </w:r>
+          </w:p>
+        </w:tc>
+        <w:tc>
+          <w:tcPr/>
+          <w:p>
+            <w:pPr>
+              <w:pStyle w:val="Compact"/>
+            </w:pPr>
+            <w:r>
+              <w:t xml:space="preserve">[−0.021, +0.006]</w:t>
+            </w:r>
+          </w:p>
+        </w:tc>
+        <w:tc>
+          <w:tcPr/>
+          <w:p>
+            <w:pPr>
+              <w:pStyle w:val="Compact"/>
+            </w:pPr>
+            <w:r>
+              <w:t xml:space="preserve">예</w:t>
+            </w:r>
+          </w:p>
+        </w:tc>
+        <w:tc>
+          <w:tcPr/>
+          <w:p>
+            <w:pPr>
+              <w:pStyle w:val="Compact"/>
+            </w:pPr>
+            <w:r>
+              <w:t xml:space="preserve">[−0.046, +0.025]</w:t>
+            </w:r>
+          </w:p>
+        </w:tc>
+        <w:tc>
+          <w:tcPr/>
+          <w:p>
+            <w:pPr>
+              <w:pStyle w:val="Compact"/>
+            </w:pPr>
+            <w:r>
+              <w:rPr>
+                <w:b/>
+                <w:bCs/>
+              </w:rPr>
+              <w:t xml:space="preserve">예</w:t>
+            </w:r>
+          </w:p>
+        </w:tc>
+      </w:tr>
+    </w:tbl>
+    <w:p>
+      <w:pPr>
+        <w:pStyle w:val="BodyText"/>
+      </w:pPr>
+      <w:r>
+        <w:t xml:space="preserve">클립 단위 구간을 보고했다면 결론을</w:t>
+      </w:r>
+      <w:r>
+        <w:t xml:space="preserve"> </w:t>
+      </w:r>
+      <w:r>
+        <w:rPr>
+          <w:b/>
+          <w:bCs/>
+        </w:rPr>
+        <w:t xml:space="preserve">세 번째로</w:t>
+      </w:r>
+      <w:r>
+        <w:t xml:space="preserve"> </w:t>
+      </w:r>
+      <w:r>
+        <w:t xml:space="preserve">— 다시 "SVM 유의 우세"로 — 뒤집었을 것이다.</w:t>
+      </w:r>
+      <w:r>
+        <w:t xml:space="preserve"> </w:t>
+      </w:r>
+      <w:r>
+        <w:t xml:space="preserve">함정 (i), (ii)와 달리 이 함정은 어떤 보고된 결과에도 진입하지 않았다. 출판 전에 포착했기 때문이다.</w:t>
+      </w:r>
+      <w:r>
+        <w:t xml:space="preserve"> </w:t>
+      </w:r>
+      <w:r>
+        <w:t xml:space="preserve">이 함정을 특별히 표시하는 이유는 포착이</w:t>
+      </w:r>
+      <w:r>
+        <w:t xml:space="preserve"> </w:t>
+      </w:r>
+      <w:r>
+        <w:rPr>
+          <w:i/>
+          <w:iCs/>
+        </w:rPr>
+        <w:t xml:space="preserve">더 어렵기</w:t>
+      </w:r>
+      <w:r>
+        <w:t xml:space="preserve"> </w:t>
+      </w:r>
+      <w:r>
+        <w:t xml:space="preserve">때문이다. 더 엄밀한 방법(클러스터 부트스트랩)을</w:t>
+      </w:r>
+      <w:r>
+        <w:t xml:space="preserve"> </w:t>
+      </w:r>
+      <w:r>
+        <w:t xml:space="preserve">도입하면서 한 수준 얕게 멈추는 데서 발생한다. fold 단위의 넓은 구간(n=4 악기)은 숨길 약점이 아니라</w:t>
+      </w:r>
+      <w:r>
+        <w:t xml:space="preserve"> </w:t>
+      </w:r>
+      <w:r>
+        <w:t xml:space="preserve">"다른 악기에서도 유지되는가"에 대한 정직한 답이다.</w:t>
+      </w:r>
+    </w:p>
+    <w:bookmarkEnd w:id="24"/>
+    <w:bookmarkStart w:id="25" w:name="Xc828ea9677b86b5e968c1958d721b11f7cfc0b6"/>
+    <w:p>
+      <w:pPr>
+        <w:pStyle w:val="Heading3"/>
+      </w:pPr>
+      <w:r>
+        <w:t xml:space="preserve">4.4 착지: 조건부 동급</w:t>
+      </w:r>
+    </w:p>
+    <w:p>
+      <w:pPr>
+        <w:pStyle w:val="FirstParagraph"/>
+      </w:pPr>
+      <w:r>
+        <w:t xml:space="preserve">세 함정을 모두 제거하면, 교정된 그림은</w:t>
+      </w:r>
+      <w:r>
+        <w:t xml:space="preserve"> </w:t>
+      </w:r>
+      <w:r>
+        <w:rPr>
+          <w:b/>
+          <w:bCs/>
+        </w:rPr>
+        <w:t xml:space="preserve">조건부 동급</w:t>
+      </w:r>
+      <w:r>
+        <w:t xml:space="preserve">이다. 튜닝된 245차원 SVM과 튜닝된 MERT</w:t>
+      </w:r>
+      <w:r>
+        <w:t xml:space="preserve"> </w:t>
+      </w:r>
+      <w:r>
+        <w:t xml:space="preserve">헤드는 5~50% 라벨 예산 전 구간에서 통계적으로 구분되지 않는다(모든 격차 ±0.7 fold 표준편차 이내,</w:t>
+      </w:r>
+      <w:r>
+        <w:t xml:space="preserve"> </w:t>
+      </w:r>
+      <w:r>
+        <w:t xml:space="preserve">§4.2; 모든 fold 단위 구간이 0을 포함, §4.3). SVM이 단지 클립 길이 차이를 이용하는 것 아니냐는</w:t>
+      </w:r>
+      <w:r>
+        <w:t xml:space="preserve"> </w:t>
+      </w:r>
+      <w:r>
+        <w:t xml:space="preserve">길이 confound는 길이 전용 기준선(단일 길이 특징)으로 배제한다. 이 기준선은 LOSO에서 macro-F1</w:t>
+      </w:r>
+      <w:r>
+        <w:t xml:space="preserve"> </w:t>
+      </w:r>
+      <w:r>
+        <w:t xml:space="preserve">0.400에 그치는 반면 전체 245차원 특징은 0.906이다(격차 0.506). 나아가 특징에서 길이 성분을 회귀로</w:t>
+      </w:r>
+      <w:r>
+        <w:t xml:space="preserve"> </w:t>
+      </w:r>
+      <w:r>
+        <w:t xml:space="preserve">제거해도 성능은 거의 유지되고(0.906 → 0.893), 온셋 계열 특징은 잔차화 후 오히려</w:t>
+      </w:r>
+      <w:r>
+        <w:t xml:space="preserve"> </w:t>
+      </w:r>
+      <w:r>
+        <w:rPr>
+          <w:i/>
+          <w:iCs/>
+        </w:rPr>
+        <w:t xml:space="preserve">상승</w:t>
+      </w:r>
+      <w:r>
+        <w:t xml:space="preserve">한다(0.673</w:t>
+      </w:r>
+      <w:r>
+        <w:t xml:space="preserve"> </w:t>
+      </w:r>
+      <w:r>
+        <w:t xml:space="preserve">→ 0.694). 단순한 길이 프록시였다면 붕괴했어야 한다.</w:t>
+      </w:r>
+    </w:p>
+    <w:p>
+      <w:pPr>
+        <w:pStyle w:val="BodyText"/>
+      </w:pPr>
+      <w:r>
+        <w:rPr>
+          <w:b/>
+          <w:bCs/>
+        </w:rPr>
+        <w:t xml:space="preserve">더 큰 튜닝 예산이 백본을 구제하는가?</w:t>
+      </w:r>
+      <w:r>
+        <w:t xml:space="preserve"> </w:t>
+      </w:r>
+      <w:r>
+        <w:t xml:space="preserve">§4.2에 대한 자연스러운 반론은, 우리가</w:t>
+      </w:r>
+      <w:r>
+        <w:t xml:space="preserve"> </w:t>
+      </w:r>
+      <w:r>
+        <w:rPr>
+          <w:i/>
+          <w:iCs/>
+        </w:rPr>
+        <w:t xml:space="preserve">동결된</w:t>
+      </w:r>
+      <w:r>
+        <w:t xml:space="preserve"> </w:t>
+      </w:r>
+      <w:r>
+        <w:t xml:space="preserve">헤드만</w:t>
+      </w:r>
+      <w:r>
+        <w:t xml:space="preserve"> </w:t>
+      </w:r>
+      <w:r>
+        <w:t xml:space="preserve">튜닝했으므로 백본 자체를 적응시키면 MERT에 격차가 열릴 수 있다는 것이다. 그렇지 않다. 오히려</w:t>
+      </w:r>
+      <w:r>
+        <w:t xml:space="preserve"> </w:t>
+      </w:r>
+      <w:r>
+        <w:t xml:space="preserve">반대이다. 우리는 단일 튜닝 예산 스펙트럼 위에 다섯 지점을 놓는다(표 4.4): SVM → 동결-선형 헤드 →</w:t>
+      </w:r>
+      <w:r>
+        <w:t xml:space="preserve"> </w:t>
+      </w:r>
+      <w:r>
+        <w:t xml:space="preserve">동결-튜닝 헤드 → 학습된 층 가중 → 백본에 대한 LoRA 적응(r=8, q/v 투영).</w:t>
+      </w:r>
+    </w:p>
+    <w:tbl>
+      <w:tblPr>
+        <w:tblStyle w:val="Table"/>
+        <w:tblW w:type="auto" w:w="0"/>
+        <w:tblLook w:firstRow="1" w:lastRow="0" w:firstColumn="0" w:lastColumn="0" w:noHBand="0" w:noVBand="0" w:val="0020"/>
+      </w:tblPr>
+      <w:tblGrid>
+        <w:gridCol w:w="1320"/>
+        <w:gridCol w:w="1320"/>
+        <w:gridCol w:w="1320"/>
+        <w:gridCol w:w="1320"/>
+        <w:gridCol w:w="1320"/>
+        <w:gridCol w:w="1320"/>
+      </w:tblGrid>
+      <w:tr>
+        <w:trPr>
+          <w:tblHeader w:val="on"/>
+        </w:trPr>
+        <w:tc>
+          <w:tcPr/>
+          <w:p>
+            <w:pPr>
+              <w:pStyle w:val="Compact"/>
+            </w:pPr>
+            <w:r>
               <w:t xml:space="preserve">시드</w:t>
             </w:r>
           </w:p>
@@ -5532,22 +5574,13 @@
         <w:t xml:space="preserve"> </w:t>
       </w:r>
       <w:r>
-        <w:t xml:space="preserve">대등하거나 약간 앞선다(20%에서 0.855 대 0.832; 50%에서 0.900 대 0.868) — §4.2의</w:t>
-      </w:r>
-      <w:r>
-        <w:t xml:space="preserve"> </w:t>
-      </w:r>
-      <w:r>
-        <w:t xml:space="preserve">“관행에 맞춘</w:t>
-      </w:r>
-      <w:r>
-        <w:t xml:space="preserve"> </w:t>
-      </w:r>
-      <w:r>
-        <w:t xml:space="preserve">프로빙은 동급에 도달한다”</w:t>
-      </w:r>
-      <w:r>
-        <w:t xml:space="preserve">와 같은 결과가 스펙트럼 최상단에서 재현된 것이다. 둘째, LoRA로 백본을</w:t>
+        <w:t xml:space="preserve">대등하거나 약간 앞선다(20%에서 0.855 대 0.832; 50%에서 0.900 대 0.868) — §4.2의 "관행에 맞춘</w:t>
+      </w:r>
+      <w:r>
+        <w:t xml:space="preserve"> </w:t>
+      </w:r>
+      <w:r>
+        <w:t xml:space="preserve">프로빙은 동급에 도달한다"와 같은 결과가 스펙트럼 최상단에서 재현된 것이다. 둘째, LoRA로 백본을</w:t>
       </w:r>
       <w:r>
         <w:t xml:space="preserve"> </w:t>
@@ -5613,16 +5646,7 @@
         <w:t xml:space="preserve"> </w:t>
       </w:r>
       <w:r>
-        <w:t xml:space="preserve">(LP-FT 효과, Kumar 등[cite, 2022 ICLR]). 따라서</w:t>
-      </w:r>
-      <w:r>
-        <w:t xml:space="preserve"> </w:t>
-      </w:r>
-      <w:r>
-        <w:t xml:space="preserve">“충분히 미세조정하지 않았을 뿐”</w:t>
-      </w:r>
-      <w:r>
-        <w:t xml:space="preserve">이라는 반론은 가장</w:t>
+        <w:t xml:space="preserve">(LP-FT 효과, Kumar 등[26]). 따라서 "충분히 미세조정하지 않았을 뿐"이라는 반론은 가장</w:t>
       </w:r>
       <w:r>
         <w:t xml:space="preserve"> </w:t>
@@ -5653,20 +5677,7 @@
         <w:t xml:space="preserve"> </w:t>
       </w:r>
       <w:r>
-        <w:t xml:space="preserve">아니라</w:t>
-      </w:r>
-      <w:r>
-        <w:t xml:space="preserve"> </w:t>
-      </w:r>
-      <w:r>
-        <w:rPr>
-          <w:b/>
-          <w:bCs/>
-        </w:rPr>
-        <w:t xml:space="preserve">OOD(분포 외) 평가 환경에서 발생하는 LP-FT 효과의 일관된 방향성(directional signal)</w:t>
-      </w:r>
-      <w:r>
-        <w:t xml:space="preserve">으로</w:t>
+        <w:t xml:space="preserve">아니라 **OOD(분포 외) 평가 환경에서 발생하는 LP-FT 효과의 일관된 방향성(directional signal)**으로</w:t>
       </w:r>
       <w:r>
         <w:t xml:space="preserve"> </w:t>
@@ -5723,7 +5734,7 @@
     </w:p>
     <w:bookmarkEnd w:id="25"/>
     <w:bookmarkEnd w:id="26"/>
-    <w:bookmarkStart w:id="31" w:name="논의-discussion"/>
+    <w:bookmarkStart w:id="43" w:name="X1985c68f99cebe1fad86d8d7d98df4026f3bd3d"/>
     <w:p>
       <w:pPr>
         <w:pStyle w:val="Heading2"/>
@@ -5772,7 +5783,7 @@
         <w:t xml:space="preserve">묻고, 주장을 한정하는 두 가지 정직한 음성 결과를 보고한다.</w:t>
       </w:r>
     </w:p>
-    <w:bookmarkStart w:id="27" w:name="왜-깊이가-도움이-되지-않는가-층별-서술자-프로브"/>
+    <w:bookmarkStart w:id="30" w:name="X1e36564aa8bb90dd799449cdd190970bd36ffed"/>
     <w:p>
       <w:pPr>
         <w:pStyle w:val="Heading3"/>
@@ -5792,16 +5803,7 @@
         <w:t xml:space="preserve"> </w:t>
       </w:r>
       <w:r>
-        <w:t xml:space="preserve">LOSO, out-of-fold R²). 각 층을</w:t>
-      </w:r>
-      <w:r>
-        <w:t xml:space="preserve"> </w:t>
-      </w:r>
-      <w:r>
-        <w:t xml:space="preserve">“이 서술자가 여기서 얼마나 선형적으로 가용한가”</w:t>
-      </w:r>
-      <w:r>
-        <w:t xml:space="preserve">로 읽는다. 그 양상이</w:t>
+        <w:t xml:space="preserve">LOSO, out-of-fold R²). 각 층을 "이 서술자가 여기서 얼마나 선형적으로 가용한가"로 읽는다. 그 양상이</w:t>
       </w:r>
       <w:r>
         <w:t xml:space="preserve"> </w:t>
@@ -5813,8 +5815,7 @@
     <w:tbl>
       <w:tblPr>
         <w:tblStyle w:val="Table"/>
-        <w:tblW w:type="pct" w:w="5000"/>
-        <w:tblLayout w:type="fixed"/>
+        <w:tblW w:type="auto" w:w="0"/>
         <w:tblLook w:firstRow="1" w:lastRow="0" w:firstColumn="0" w:lastColumn="0" w:noHBand="0" w:noVBand="0" w:val="0020"/>
       </w:tblPr>
       <w:tblGrid>
@@ -6130,7 +6131,90 @@
         <w:pStyle w:val="BodyText"/>
       </w:pPr>
       <w:r>
-        <w:t xml:space="preserve">세 가지가 두드러진다.</w:t>
+        <w:drawing>
+          <wp:inline>
+            <wp:extent cx="5334000" cy="4364181"/>
+            <wp:effectExtent b="0" l="0" r="0" t="0"/>
+            <wp:docPr descr="그림 1: 층별 서술자 프로브 히트맵과 선그래프" title="" id="28" name="Picture"/>
+            <a:graphic>
+              <a:graphicData uri="http://schemas.openxmlformats.org/drawingml/2006/picture">
+                <pic:pic>
+                  <pic:nvPicPr>
+                    <pic:cNvPr descr="../results/phase3/descriptor_probe.png" id="29" name="Picture"/>
+                    <pic:cNvPicPr>
+                      <a:picLocks noChangeArrowheads="1" noChangeAspect="1"/>
+                    </pic:cNvPicPr>
+                  </pic:nvPicPr>
+                  <pic:blipFill>
+                    <a:blip r:embed="rId27"/>
+                    <a:stretch>
+                      <a:fillRect/>
+                    </a:stretch>
+                  </pic:blipFill>
+                  <pic:spPr bwMode="auto">
+                    <a:xfrm>
+                      <a:off x="0" y="0"/>
+                      <a:ext cx="5334000" cy="4364181"/>
+                    </a:xfrm>
+                    <a:prstGeom prst="rect">
+                      <a:avLst/>
+                    </a:prstGeom>
+                    <a:noFill/>
+                    <a:ln w="9525">
+                      <a:noFill/>
+                      <a:headEnd/>
+                      <a:tailEnd/>
+                    </a:ln>
+                  </pic:spPr>
+                </pic:pic>
+              </a:graphicData>
+            </a:graphic>
+          </wp:inline>
+        </w:drawing>
+      </w:r>
+    </w:p>
+    <w:p>
+      <w:pPr>
+        <w:pStyle w:val="BodyText"/>
+      </w:pPr>
+      <w:r>
+        <w:rPr>
+          <w:b/>
+          <w:bCs/>
+        </w:rPr>
+        <w:t xml:space="preserve">그림 1. 층별 서술자 프로브 (LOSO out-of-fold R²).</w:t>
+      </w:r>
+      <w:r>
+        <w:t xml:space="preserve"> </w:t>
+      </w:r>
+      <w:r>
+        <w:t xml:space="preserve">상단 히트맵은 MERT 각 층(L0–L12)에서 각</w:t>
+      </w:r>
+      <w:r>
+        <w:t xml:space="preserve"> </w:t>
+      </w:r>
+      <w:r>
+        <w:t xml:space="preserve">음향 서술자가 선형적으로 얼마나 가용한지를, 하단 선그래프는 같은 값을(회색 막대 = 기법 분류용</w:t>
+      </w:r>
+      <w:r>
+        <w:t xml:space="preserve"> </w:t>
+      </w:r>
+      <w:r>
+        <w:t xml:space="preserve">학습된 층 가중치, §5.3) 보인다. 핵심 단서 온셋 강도 포락선은 이미 L0(합성곱 프론트엔드)에서</w:t>
+      </w:r>
+      <w:r>
+        <w:t xml:space="preserve"> </w:t>
+      </w:r>
+      <w:r>
+        <w:t xml:space="preserve">R²=0.77로 포화하며, 깊이에 따라 일관되게 증가하는 유일한 서술자는 음성 대조군 크로마이다.</w:t>
+      </w:r>
+    </w:p>
+    <w:p>
+      <w:pPr>
+        <w:pStyle w:val="BodyText"/>
+      </w:pPr>
+      <w:r>
+        <w:t xml:space="preserve">세 가지가 두드러진다(그림 1).</w:t>
       </w:r>
       <w:r>
         <w:t xml:space="preserve"> </w:t>
@@ -6273,7 +6357,7 @@
         <w:t xml:space="preserve"> </w:t>
       </w:r>
       <w:r>
-        <w:t xml:space="preserve">뿐이다. 이는 Pasad 등[cite]의 음성 층별 발견에 대한 오디오-주법 대응물이며, 무거운 백본이 여기서</w:t>
+        <w:t xml:space="preserve">뿐이다. 이는 Pasad 등[21]의 음성 층별 발견에 대한 오디오-주법 대응물이며, 무거운 백본이 여기서</w:t>
       </w:r>
       <w:r>
         <w:t xml:space="preserve"> </w:t>
@@ -6358,16 +6442,7 @@
         <w:t xml:space="preserve"> </w:t>
       </w:r>
       <w:r>
-        <w:t xml:space="preserve">— 이는 Musgrave 등[cite]의</w:t>
-      </w:r>
-      <w:r>
-        <w:t xml:space="preserve"> </w:t>
-      </w:r>
-      <w:r>
-        <w:t xml:space="preserve">“튜닝 예산 효과가 방법 효과를 능가한다”</w:t>
-      </w:r>
-      <w:r>
-        <w:t xml:space="preserve">의 MIR 판이며,</w:t>
+        <w:t xml:space="preserve">— 이는 Musgrave 등[18]의 "튜닝 예산 효과가 방법 효과를 능가한다"의 MIR 판이며,</w:t>
       </w:r>
       <w:r>
         <w:t xml:space="preserve"> </w:t>
@@ -6421,7 +6496,7 @@
         <w:t xml:space="preserve"> </w:t>
       </w:r>
       <w:r>
-        <w:t xml:space="preserve">프로브 아래로 떨어지고 데이터가 많을수록 나빠지는 것으로 나타난다(Kumar 등[cite]의 LP-FT 효과).</w:t>
+        <w:t xml:space="preserve">프로브 아래로 떨어지고 데이터가 많을수록 나빠지는 것으로 나타난다(Kumar 등[26]의 LP-FT 효과).</w:t>
       </w:r>
       <w:r>
         <w:t xml:space="preserve"> </w:t>
@@ -6446,8 +6521,8 @@
         <w:t xml:space="preserve">예측한다.</w:t>
       </w:r>
     </w:p>
-    <w:bookmarkEnd w:id="27"/>
-    <w:bookmarkStart w:id="28" w:name="값싼-특징이-부호화하는-것-음악가-지식에-대조한-shap"/>
+    <w:bookmarkEnd w:id="30"/>
+    <w:bookmarkStart w:id="40" w:name="Xb62f2bd62b1549fdf357110e661df8a8d413eb4"/>
     <w:p>
       <w:pPr>
         <w:pStyle w:val="Heading3"/>
@@ -6605,7 +6680,7 @@
         <w:t xml:space="preserve"> </w:t>
       </w:r>
       <w:r>
-        <w:t xml:space="preserve">— 바로 이 인접성이 두 주법을 가장 구분하기 어렵게 만든다.</w:t>
+        <w:t xml:space="preserve">— 바로 이 인접성이 두 주법을 가장 구분하기 어렵게 만든다(그림 2, 그림 3).</w:t>
       </w:r>
     </w:p>
     <w:p>
@@ -6613,6 +6688,166 @@
         <w:pStyle w:val="BodyText"/>
       </w:pPr>
       <w:r>
+        <w:drawing>
+          <wp:inline>
+            <wp:extent cx="5334000" cy="1905000"/>
+            <wp:effectExtent b="0" l="0" r="0" t="0"/>
+            <wp:docPr descr="그림 2: 차원 보정 SHAP 그룹 중요도 막대그래프" title="" id="32" name="Picture"/>
+            <a:graphic>
+              <a:graphicData uri="http://schemas.openxmlformats.org/drawingml/2006/picture">
+                <pic:pic>
+                  <pic:nvPicPr>
+                    <pic:cNvPr descr="../results/phase3/shap_group_bar.png" id="33" name="Picture"/>
+                    <pic:cNvPicPr>
+                      <a:picLocks noChangeArrowheads="1" noChangeAspect="1"/>
+                    </pic:cNvPicPr>
+                  </pic:nvPicPr>
+                  <pic:blipFill>
+                    <a:blip r:embed="rId31"/>
+                    <a:stretch>
+                      <a:fillRect/>
+                    </a:stretch>
+                  </pic:blipFill>
+                  <pic:spPr bwMode="auto">
+                    <a:xfrm>
+                      <a:off x="0" y="0"/>
+                      <a:ext cx="5334000" cy="1905000"/>
+                    </a:xfrm>
+                    <a:prstGeom prst="rect">
+                      <a:avLst/>
+                    </a:prstGeom>
+                    <a:noFill/>
+                    <a:ln w="9525">
+                      <a:noFill/>
+                      <a:headEnd/>
+                      <a:tailEnd/>
+                    </a:ln>
+                  </pic:spPr>
+                </pic:pic>
+              </a:graphicData>
+            </a:graphic>
+          </wp:inline>
+        </w:drawing>
+      </w:r>
+    </w:p>
+    <w:p>
+      <w:pPr>
+        <w:pStyle w:val="BodyText"/>
+      </w:pPr>
+      <w:r>
+        <w:rPr>
+          <w:b/>
+          <w:bCs/>
+        </w:rPr>
+        <w:t xml:space="preserve">그림 2. 차원 보정 SHAP 그룹 중요도 (XGBoost 대리 모델).</w:t>
+      </w:r>
+      <w:r>
+        <w:t xml:space="preserve"> </w:t>
+      </w:r>
+      <w:r>
+        <w:t xml:space="preserve">왼쪽은 원시 합(특징 수에 편향되어</w:t>
+      </w:r>
+      <w:r>
+        <w:t xml:space="preserve"> </w:t>
+      </w:r>
+      <w:r>
+        <w:t xml:space="preserve">MFCC 계열이 커 보임), 오른쪽은 특징당 평균(차원 보정). 온셋 강도 포락선이 특징당 0.481로 압도적</w:t>
+      </w:r>
+      <w:r>
+        <w:t xml:space="preserve"> </w:t>
+      </w:r>
+      <w:r>
+        <w:t xml:space="preserve">1위이며, 크로마는 0.004로 최하위권이다.</w:t>
+      </w:r>
+    </w:p>
+    <w:p>
+      <w:pPr>
+        <w:pStyle w:val="BodyText"/>
+      </w:pPr>
+      <w:r>
+        <w:drawing>
+          <wp:inline>
+            <wp:extent cx="5334000" cy="2222500"/>
+            <wp:effectExtent b="0" l="0" r="0" t="0"/>
+            <wp:docPr descr="그림 3: flux_std_0에 대한 클래스별 방향성 SHAP 산점도" title="" id="35" name="Picture"/>
+            <a:graphic>
+              <a:graphicData uri="http://schemas.openxmlformats.org/drawingml/2006/picture">
+                <pic:pic>
+                  <pic:nvPicPr>
+                    <pic:cNvPr descr="../results/phase3/shap_flux_direction.png" id="36" name="Picture"/>
+                    <pic:cNvPicPr>
+                      <a:picLocks noChangeArrowheads="1" noChangeAspect="1"/>
+                    </pic:cNvPicPr>
+                  </pic:nvPicPr>
+                  <pic:blipFill>
+                    <a:blip r:embed="rId34"/>
+                    <a:stretch>
+                      <a:fillRect/>
+                    </a:stretch>
+                  </pic:blipFill>
+                  <pic:spPr bwMode="auto">
+                    <a:xfrm>
+                      <a:off x="0" y="0"/>
+                      <a:ext cx="5334000" cy="2222500"/>
+                    </a:xfrm>
+                    <a:prstGeom prst="rect">
+                      <a:avLst/>
+                    </a:prstGeom>
+                    <a:noFill/>
+                    <a:ln w="9525">
+                      <a:noFill/>
+                      <a:headEnd/>
+                      <a:tailEnd/>
+                    </a:ln>
+                  </pic:spPr>
+                </pic:pic>
+              </a:graphicData>
+            </a:graphic>
+          </wp:inline>
+        </w:drawing>
+      </w:r>
+    </w:p>
+    <w:p>
+      <w:pPr>
+        <w:pStyle w:val="BodyText"/>
+      </w:pPr>
+      <w:r>
+        <w:rPr>
+          <w:b/>
+          <w:bCs/>
+        </w:rPr>
+        <w:t xml:space="preserve">그림 3. flux_std_0에 대한 방향성 SHAP.</w:t>
+      </w:r>
+      <w:r>
+        <w:t xml:space="preserve"> </w:t>
+      </w:r>
+      <w:r>
+        <w:rPr>
+          <w:rStyle w:val="VerbatimChar"/>
+        </w:rPr>
+        <w:t xml:space="preserve">col legno battuto</w:t>
+      </w:r>
+      <w:r>
+        <w:t xml:space="preserve">는 낮은 flux 분산(중앙값 0.18)에서,</w:t>
+      </w:r>
+      <w:r>
+        <w:t xml:space="preserve"> </w:t>
+      </w:r>
+      <w:r>
+        <w:rPr>
+          <w:rStyle w:val="VerbatimChar"/>
+        </w:rPr>
+        <w:t xml:space="preserve">ordinario</w:t>
+      </w:r>
+      <w:r>
+        <w:t xml:space="preserve">는 중간 수준(중앙값 0.51)에서 각 클래스로 밀린다 — SHAP 방향이 클래스별 물리와 일치한다.</w:t>
+      </w:r>
+    </w:p>
+    <w:p>
+      <w:pPr>
+        <w:pStyle w:val="BodyText"/>
+      </w:pPr>
+      <w:r>
         <w:t xml:space="preserve">대리 모델 충실도는 정직하게 보고한다.</w:t>
       </w:r>
       <w:r>
@@ -6632,7 +6867,7 @@
         <w:t xml:space="preserve"> </w:t>
       </w:r>
       <w:r>
-        <w:t xml:space="preserve">헤드와 보류 클립의 91.4%에서 일치하며(Cohen’s κ=0.882), 이는 상당하지만 이전 판이 잘못 보고한</w:t>
+        <w:t xml:space="preserve">헤드와 보류 클립의 91.4%에서 일치하며(Cohen's κ=0.882), 이는 상당하지만 이전 판이 잘못 보고한</w:t>
       </w:r>
       <w:r>
         <w:t xml:space="preserve"> </w:t>
@@ -6690,11 +6925,109 @@
         <w:t xml:space="preserve"> </w:t>
       </w:r>
       <w:r>
-        <w:t xml:space="preserve">대한 단일 기전으로 과장하지 않는다.</w:t>
-      </w:r>
-    </w:p>
-    <w:bookmarkEnd w:id="28"/>
-    <w:bookmarkStart w:id="29" w:name="두-가지-정직한-음성-결과"/>
+        <w:t xml:space="preserve">대한 단일 기전으로 과장하지 않는다(그림 4).</w:t>
+      </w:r>
+    </w:p>
+    <w:p>
+      <w:pPr>
+        <w:pStyle w:val="BodyText"/>
+      </w:pPr>
+      <w:r>
+        <w:drawing>
+          <wp:inline>
+            <wp:extent cx="5334000" cy="2667000"/>
+            <wp:effectExtent b="0" l="0" r="0" t="0"/>
+            <wp:docPr descr="그림 4: 클래스별 대리 모델 충실도 Cohen κ 막대그래프" title="" id="38" name="Picture"/>
+            <a:graphic>
+              <a:graphicData uri="http://schemas.openxmlformats.org/drawingml/2006/picture">
+                <pic:pic>
+                  <pic:nvPicPr>
+                    <pic:cNvPr descr="../results/phase3/shap_surrogate_fidelity.png" id="39" name="Picture"/>
+                    <pic:cNvPicPr>
+                      <a:picLocks noChangeArrowheads="1" noChangeAspect="1"/>
+                    </pic:cNvPicPr>
+                  </pic:nvPicPr>
+                  <pic:blipFill>
+                    <a:blip r:embed="rId37"/>
+                    <a:stretch>
+                      <a:fillRect/>
+                    </a:stretch>
+                  </pic:blipFill>
+                  <pic:spPr bwMode="auto">
+                    <a:xfrm>
+                      <a:off x="0" y="0"/>
+                      <a:ext cx="5334000" cy="2667000"/>
+                    </a:xfrm>
+                    <a:prstGeom prst="rect">
+                      <a:avLst/>
+                    </a:prstGeom>
+                    <a:noFill/>
+                    <a:ln w="9525">
+                      <a:noFill/>
+                      <a:headEnd/>
+                      <a:tailEnd/>
+                    </a:ln>
+                  </pic:spPr>
+                </pic:pic>
+              </a:graphicData>
+            </a:graphic>
+          </wp:inline>
+        </w:drawing>
+      </w:r>
+    </w:p>
+    <w:p>
+      <w:pPr>
+        <w:pStyle w:val="BodyText"/>
+      </w:pPr>
+      <w:r>
+        <w:rPr>
+          <w:b/>
+          <w:bCs/>
+        </w:rPr>
+        <w:t xml:space="preserve">그림 4. 대리 모델 충실도 (표본 외 Cohen's κ).</w:t>
+      </w:r>
+      <w:r>
+        <w:t xml:space="preserve"> </w:t>
+      </w:r>
+      <w:r>
+        <w:t xml:space="preserve">XGBoost 대리 모델과 MERT 헤드의 클래스별</w:t>
+      </w:r>
+      <w:r>
+        <w:t xml:space="preserve"> </w:t>
+      </w:r>
+      <w:r>
+        <w:t xml:space="preserve">일치도. 전체 κ=0.882이지만 희귀 클래스</w:t>
+      </w:r>
+      <w:r>
+        <w:t xml:space="preserve"> </w:t>
+      </w:r>
+      <w:r>
+        <w:rPr>
+          <w:rStyle w:val="VerbatimChar"/>
+        </w:rPr>
+        <w:t xml:space="preserve">sul ponticello</w:t>
+      </w:r>
+      <w:r>
+        <w:t xml:space="preserve">(0.74)·</w:t>
+      </w:r>
+      <w:r>
+        <w:rPr>
+          <w:rStyle w:val="VerbatimChar"/>
+        </w:rPr>
+        <w:t xml:space="preserve">col legno battuto</w:t>
+      </w:r>
+      <w:r>
+        <w:t xml:space="preserve">(0.72)에서 가장</w:t>
+      </w:r>
+      <w:r>
+        <w:t xml:space="preserve"> </w:t>
+      </w:r>
+      <w:r>
+        <w:t xml:space="preserve">약하다 — 이 두 클래스의 SHAP 해석은 조심스레 전이된다.</w:t>
+      </w:r>
+    </w:p>
+    <w:bookmarkEnd w:id="40"/>
+    <w:bookmarkStart w:id="41" w:name="X32eb6d94ee0044df02518478a95be6c4b25c1a5"/>
     <w:p>
       <w:pPr>
         <w:pStyle w:val="Heading3"/>
@@ -6812,13 +7145,19 @@
         <w:t xml:space="preserve"> </w:t>
       </w:r>
       <w:r>
-        <w:t xml:space="preserve">Qwen2-Audio의 실패는 SHAP 구조와 시사적으로 상관된다 —</w:t>
-      </w:r>
-      <w:r>
-        <w:t xml:space="preserve"> </w:t>
-      </w:r>
-      <w:r>
-        <w:t xml:space="preserve">음향적으로 고립된</w:t>
+        <w:t xml:space="preserve">오디오 언어모델(Qwen2-Audio-7B-Instruct)을 125개 클립</w:t>
+      </w:r>
+      <w:r>
+        <w:t xml:space="preserve"> </w:t>
+      </w:r>
+      <w:r>
+        <w:t xml:space="preserve">× 2개 질문 유형(예/아니오, 개방형)으로 평가하면, 전체 정확도는 예/아니오 50.4%(이진 질문에서 우연</w:t>
+      </w:r>
+      <w:r>
+        <w:t xml:space="preserve"> </w:t>
+      </w:r>
+      <w:r>
+        <w:t xml:space="preserve">수준), 개방형 20.0%에 그친다. 이 실패는 SHAP 구조와 시사적으로 상관된다 — 음향적으로 고립된</w:t>
       </w:r>
       <w:r>
         <w:t xml:space="preserve"> </w:t>
@@ -6830,13 +7169,7 @@
         <w:t xml:space="preserve">pizzicato secco</w:t>
       </w:r>
       <w:r>
-        <w:t xml:space="preserve">에는 100% 정답이지만, flux 공간에서 인접한 이웃에 위치하는 최상위</w:t>
-      </w:r>
-      <w:r>
-        <w:t xml:space="preserve"> </w:t>
-      </w:r>
-      <w:r>
-        <w:t xml:space="preserve">단서를 지닌</w:t>
+        <w:t xml:space="preserve">는 개방형에서 100% 정답인 반면, flux 공간에서 인접 이웃에 위치하는</w:t>
       </w:r>
       <w:r>
         <w:t xml:space="preserve"> </w:t>
@@ -6860,23 +7193,90 @@
         <w:t xml:space="preserve">tremolo</w:t>
       </w:r>
       <w:r>
-        <w:t xml:space="preserve">에는 (개방형에서) 0%이다. 그러나 이는 상관이다. 확증하려면 개입</w:t>
-      </w:r>
-      <w:r>
-        <w:t xml:space="preserve"> </w:t>
-      </w:r>
-      <w:r>
-        <w:t xml:space="preserve">실험(예: ordinario 클립의 flux_std를 인위적으로 변화시켜 ALM에 재질의)이 필요하며, 우리는 이를</w:t>
-      </w:r>
-      <w:r>
-        <w:t xml:space="preserve"> </w:t>
-      </w:r>
-      <w:r>
-        <w:t xml:space="preserve">수행하지 않았다. 이를 기전이 아니라 가설 생성적 관찰로 제시한다.</w:t>
-      </w:r>
-    </w:p>
-    <w:bookmarkEnd w:id="29"/>
-    <w:bookmarkStart w:id="30" w:name="강건성과-범위"/>
+        <w:t xml:space="preserve">는 개방형에서 0%이다. 나아가 ALM이 가장 많이 틀리는 두 클래스(</w:t>
+      </w:r>
+      <w:r>
+        <w:rPr>
+          <w:rStyle w:val="VerbatimChar"/>
+        </w:rPr>
+        <w:t xml:space="preserve">ordinario</w:t>
+      </w:r>
+      <w:r>
+        <w:t xml:space="preserve">,</w:t>
+      </w:r>
+      <w:r>
+        <w:t xml:space="preserve"> </w:t>
+      </w:r>
+      <w:r>
+        <w:rPr>
+          <w:rStyle w:val="VerbatimChar"/>
+        </w:rPr>
+        <w:t xml:space="preserve">tremolo</w:t>
+      </w:r>
+      <w:r>
+        <w:t xml:space="preserve">)는</w:t>
+      </w:r>
+      <w:r>
+        <w:t xml:space="preserve"> </w:t>
+      </w:r>
+      <w:r>
+        <w:t xml:space="preserve">우리 분류기가 가장 어려워하는 두 희귀 클래스(</w:t>
+      </w:r>
+      <w:r>
+        <w:rPr>
+          <w:rStyle w:val="VerbatimChar"/>
+        </w:rPr>
+        <w:t xml:space="preserve">sul ponticello</w:t>
+      </w:r>
+      <w:r>
+        <w:t xml:space="preserve">,</w:t>
+      </w:r>
+      <w:r>
+        <w:t xml:space="preserve"> </w:t>
+      </w:r>
+      <w:r>
+        <w:rPr>
+          <w:rStyle w:val="VerbatimChar"/>
+        </w:rPr>
+        <w:t xml:space="preserve">col legno battuto</w:t>
+      </w:r>
+      <w:r>
+        <w:t xml:space="preserve">, §5.2)와</w:t>
+      </w:r>
+      <w:r>
+        <w:t xml:space="preserve"> </w:t>
+      </w:r>
+      <w:r>
+        <w:rPr>
+          <w:b/>
+          <w:bCs/>
+        </w:rPr>
+        <w:t xml:space="preserve">서로소</w:t>
+      </w:r>
+      <w:r>
+        <w:t xml:space="preserve">로,</w:t>
+      </w:r>
+      <w:r>
+        <w:t xml:space="preserve"> </w:t>
+      </w:r>
+      <w:r>
+        <w:t xml:space="preserve">ALM의 오류가 음향적 미세함이 아니라 다른 요인(라벨 표현·언어)에서 비롯됨을 시사한다. 그러나 이는</w:t>
+      </w:r>
+      <w:r>
+        <w:t xml:space="preserve"> </w:t>
+      </w:r>
+      <w:r>
+        <w:t xml:space="preserve">모두 상관이다. 확증하려면 개입 실험(예: ordinario 클립의 flux_std를 인위적으로 변화시켜 ALM에</w:t>
+      </w:r>
+      <w:r>
+        <w:t xml:space="preserve"> </w:t>
+      </w:r>
+      <w:r>
+        <w:t xml:space="preserve">재질의)이 필요하며, 우리는 이를 수행하지 않았다. 이를 기전이 아니라 가설 생성적 관찰로 제시한다.</w:t>
+      </w:r>
+    </w:p>
+    <w:bookmarkEnd w:id="41"/>
+    <w:bookmarkStart w:id="42" w:name="X552aa87bd5b0f8011256780d45de8a95c016c34"/>
     <w:p>
       <w:pPr>
         <w:pStyle w:val="Heading3"/>
@@ -6945,9 +7345,9 @@
         </w:pict>
       </w:r>
     </w:p>
-    <w:bookmarkEnd w:id="30"/>
-    <w:bookmarkEnd w:id="31"/>
-    <w:bookmarkStart w:id="32" w:name="한계-및-향후-연구-limitations-and-future-work"/>
+    <w:bookmarkEnd w:id="42"/>
+    <w:bookmarkEnd w:id="43"/>
+    <w:bookmarkStart w:id="44" w:name="Xcb6ad78548a5164d84bf4e7c6b18bde12792332"/>
     <w:p>
       <w:pPr>
         <w:pStyle w:val="Heading2"/>
@@ -7018,13 +7418,52 @@
         <w:t xml:space="preserve">구분 불가</w:t>
       </w:r>
       <w:r>
-        <w:t xml:space="preserve">로 규정하며, 표준편차 이내의 방향성 기울기를 결론으로 승격시키지 않는다. 악기(또는 악기군)를</w:t>
-      </w:r>
-      <w:r>
-        <w:t xml:space="preserve"> </w:t>
-      </w:r>
-      <w:r>
-        <w:t xml:space="preserve">늘리면 이를 좁힐 수 있다.</w:t>
+        <w:t xml:space="preserve">로 규정하며, 표준편차 이내의 방향성 기울기를 결론으로 승격시키지 않는다. 아울러 본문의</w:t>
+      </w:r>
+      <w:r>
+        <w:t xml:space="preserve"> </w:t>
+      </w:r>
+      <w:r>
+        <w:t xml:space="preserve">"±0.7 fold 표준편차 이내"는</w:t>
+      </w:r>
+      <w:r>
+        <w:t xml:space="preserve"> </w:t>
+      </w:r>
+      <w:r>
+        <w:rPr>
+          <w:b/>
+          <w:bCs/>
+        </w:rPr>
+        <w:t xml:space="preserve">사전 지정한 등가 마진(TOST 등 형식적 등가검정)이 아니라 관측된 최대</w:t>
+      </w:r>
+      <w:r>
+        <w:rPr>
+          <w:b/>
+          <w:bCs/>
+        </w:rPr>
+        <w:t xml:space="preserve"> </w:t>
+      </w:r>
+      <w:r>
+        <w:rPr>
+          <w:b/>
+          <w:bCs/>
+        </w:rPr>
+        <w:t xml:space="preserve">격차(20%에서 0.69σ)를 요약하는 서술통계</w:t>
+      </w:r>
+      <w:r>
+        <w:t xml:space="preserve">이다. 즉 "격차가 이 밴드를 넘지 않았다"는 사실의 진술이지</w:t>
+      </w:r>
+      <w:r>
+        <w:t xml:space="preserve"> </w:t>
+      </w:r>
+      <w:r>
+        <w:t xml:space="preserve">"등가를 검정했다"는 주장이 아니다. 악기(또는 악기군)를 늘리면 형식적 등가검정이 가능해지고 이</w:t>
+      </w:r>
+      <w:r>
+        <w:t xml:space="preserve"> </w:t>
+      </w:r>
+      <w:r>
+        <w:t xml:space="preserve">구간도 좁힐 수 있다.</w:t>
       </w:r>
     </w:p>
     <w:p>
@@ -7177,7 +7616,7 @@
         <w:t xml:space="preserve"> </w:t>
       </w:r>
       <w:r>
-        <w:t xml:space="preserve">유도하는 대신 2수준 부트스트랩을 교정으로 적용하였다. 분산 분해 관점(Bouthillier 등[cite])이 향후</w:t>
+        <w:t xml:space="preserve">유도하는 대신 2수준 부트스트랩을 교정으로 적용하였다. 분산 분해 관점(Bouthillier 등[20])이 향후</w:t>
       </w:r>
       <w:r>
         <w:t xml:space="preserve"> </w:t>
@@ -7316,25 +7755,7 @@
         <w:t xml:space="preserve"> </w:t>
       </w:r>
       <w:r>
-        <w:t xml:space="preserve">함정을 재현하면</w:t>
-      </w:r>
-      <w:r>
-        <w:t xml:space="preserve"> </w:t>
-      </w:r>
-      <w:r>
-        <w:t xml:space="preserve">“우리가 마주친 함정”</w:t>
-      </w:r>
-      <w:r>
-        <w:t xml:space="preserve">을</w:t>
-      </w:r>
-      <w:r>
-        <w:t xml:space="preserve"> </w:t>
-      </w:r>
-      <w:r>
-        <w:t xml:space="preserve">“하나의 패턴”</w:t>
-      </w:r>
-      <w:r>
-        <w:t xml:space="preserve">으로 바꾸고 단일 데이터셋 한계를 직접</w:t>
+        <w:t xml:space="preserve">함정을 재현하면 "우리가 마주친 함정"을 "하나의 패턴"으로 바꾸고 단일 데이터셋 한계를 직접</w:t>
       </w:r>
       <w:r>
         <w:t xml:space="preserve"> </w:t>
@@ -7428,8 +7849,8 @@
         </w:pict>
       </w:r>
     </w:p>
-    <w:bookmarkEnd w:id="32"/>
-    <w:bookmarkStart w:id="33" w:name="재현성-reproducibility"/>
+    <w:bookmarkEnd w:id="44"/>
+    <w:bookmarkStart w:id="45" w:name="X588c86620a3dcd9e9577d55007d3dcd5fe565c9"/>
     <w:p>
       <w:pPr>
         <w:pStyle w:val="Heading2"/>
@@ -7524,8 +7945,566 @@
         <w:t xml:space="preserve">)은 릴리스에서 고정한다.</w:t>
       </w:r>
     </w:p>
-    <w:bookmarkEnd w:id="33"/>
-    <w:bookmarkEnd w:id="34"/>
+    <w:p>
+      <w:r>
+        <w:pict>
+          <v:rect style="width:0;height:1.5pt" o:hralign="center" o:hrstd="t" o:hr="t"/>
+        </w:pict>
+      </w:r>
+    </w:p>
+    <w:bookmarkEnd w:id="45"/>
+    <w:bookmarkStart w:id="46" w:name="참고문헌-references"/>
+    <w:p>
+      <w:pPr>
+        <w:pStyle w:val="Heading2"/>
+      </w:pPr>
+      <w:r>
+        <w:t xml:space="preserve">참고문헌 (References)</w:t>
+      </w:r>
+    </w:p>
+    <w:p>
+      <w:pPr>
+        <w:pStyle w:val="FirstParagraph"/>
+      </w:pPr>
+      <w:r>
+        <w:t xml:space="preserve">[1] L. Su, H.-M. Lin, and Y.-H. Yang, "Sparse modeling of magnitude and phase-derived spectra for playing technique classification,"</w:t>
+      </w:r>
+      <w:r>
+        <w:t xml:space="preserve"> </w:t>
+      </w:r>
+      <w:r>
+        <w:rPr>
+          <w:i/>
+          <w:iCs/>
+        </w:rPr>
+        <w:t xml:space="preserve">IEEE/ACM Transactions on Audio, Speech, and Language Processing</w:t>
+      </w:r>
+      <w:r>
+        <w:t xml:space="preserve">, vol. 22, no. 12, pp. 2122–2132, 2014.</w:t>
+      </w:r>
+    </w:p>
+    <w:p>
+      <w:pPr>
+        <w:pStyle w:val="BodyText"/>
+      </w:pPr>
+      <w:r>
+        <w:t xml:space="preserve">[2] A. Kruger and J. Jacobs, "Playing technique classification for bowed string instruments from raw audio,"</w:t>
+      </w:r>
+      <w:r>
+        <w:t xml:space="preserve"> </w:t>
+      </w:r>
+      <w:r>
+        <w:rPr>
+          <w:i/>
+          <w:iCs/>
+        </w:rPr>
+        <w:t xml:space="preserve">Journal of New Music Research</w:t>
+      </w:r>
+      <w:r>
+        <w:t xml:space="preserve">, vol. 49, no. 4, pp. 320–333, 2020.</w:t>
+      </w:r>
+    </w:p>
+    <w:p>
+      <w:pPr>
+        <w:pStyle w:val="BodyText"/>
+      </w:pPr>
+      <w:r>
+        <w:t xml:space="preserve">[3] I. Barbancho, C. de la Bandera, A. M. Barbancho, and L. J. Tardón, "Transcription and expressiveness detection system for violin music," in</w:t>
+      </w:r>
+      <w:r>
+        <w:t xml:space="preserve"> </w:t>
+      </w:r>
+      <w:r>
+        <w:rPr>
+          <w:i/>
+          <w:iCs/>
+        </w:rPr>
+        <w:t xml:space="preserve">Proc. IEEE Int. Conf. Acoustics, Speech and Signal Processing (ICASSP)</w:t>
+      </w:r>
+      <w:r>
+        <w:t xml:space="preserve">, Taipei, 2009, pp. 189–192.</w:t>
+      </w:r>
+    </w:p>
+    <w:p>
+      <w:pPr>
+        <w:pStyle w:val="BodyText"/>
+      </w:pPr>
+      <w:r>
+        <w:t xml:space="preserve">[4] V. Lostanlen, J. Andén, and M. Lagrange, "Extended playing techniques: The next milestone in musical instrument recognition," in</w:t>
+      </w:r>
+      <w:r>
+        <w:t xml:space="preserve"> </w:t>
+      </w:r>
+      <w:r>
+        <w:rPr>
+          <w:i/>
+          <w:iCs/>
+        </w:rPr>
+        <w:t xml:space="preserve">Proc. 5th Int. Conf. Digital Libraries for Musicology (DLfM)</w:t>
+      </w:r>
+      <w:r>
+        <w:t xml:space="preserve">, Paris, 2018. arXiv:1808.09730.</w:t>
+      </w:r>
+    </w:p>
+    <w:p>
+      <w:pPr>
+        <w:pStyle w:val="BodyText"/>
+      </w:pPr>
+      <w:r>
+        <w:t xml:space="preserve">[5] C. Wang, E. Benetos, V. Lostanlen, and E. Chew, "Playing technique recognition by joint time–frequency scattering," in</w:t>
+      </w:r>
+      <w:r>
+        <w:t xml:space="preserve"> </w:t>
+      </w:r>
+      <w:r>
+        <w:rPr>
+          <w:i/>
+          <w:iCs/>
+        </w:rPr>
+        <w:t xml:space="preserve">Proc. IEEE ICASSP</w:t>
+      </w:r>
+      <w:r>
+        <w:t xml:space="preserve">, 2020.</w:t>
+      </w:r>
+    </w:p>
+    <w:p>
+      <w:pPr>
+        <w:pStyle w:val="BodyText"/>
+      </w:pPr>
+      <w:r>
+        <w:t xml:space="preserve">[6] C. Wang, E. Benetos, V. Lostanlen, and E. Chew, "Adaptive scattering transforms for playing technique recognition,"</w:t>
+      </w:r>
+      <w:r>
+        <w:t xml:space="preserve"> </w:t>
+      </w:r>
+      <w:r>
+        <w:rPr>
+          <w:i/>
+          <w:iCs/>
+        </w:rPr>
+        <w:t xml:space="preserve">IEEE/ACM Transactions on Audio, Speech, and Language Processing</w:t>
+      </w:r>
+      <w:r>
+        <w:t xml:space="preserve">, vol. 30, pp. 1407–1421, 2022.</w:t>
+      </w:r>
+    </w:p>
+    <w:p>
+      <w:pPr>
+        <w:pStyle w:val="BodyText"/>
+      </w:pPr>
+      <w:r>
+        <w:t xml:space="preserve">[7] J.-F. Ducher and P. Esling, "Folded CQT RCNN for real-time recognition of instrument playing techniques," in</w:t>
+      </w:r>
+      <w:r>
+        <w:t xml:space="preserve"> </w:t>
+      </w:r>
+      <w:r>
+        <w:rPr>
+          <w:i/>
+          <w:iCs/>
+        </w:rPr>
+        <w:t xml:space="preserve">Proc. Int. Society for Music Information Retrieval Conf. (ISMIR)</w:t>
+      </w:r>
+      <w:r>
+        <w:t xml:space="preserve">, 2019, pp. 708–714.</w:t>
+      </w:r>
+    </w:p>
+    <w:p>
+      <w:pPr>
+        <w:pStyle w:val="BodyText"/>
+      </w:pPr>
+      <w:r>
+        <w:t xml:space="preserve">[8] Z. Wang, J. Li, X. Chen, Z. Li, S. Zhang, B. Han, and D. Yang, "Musical instrument playing technique detection based on FCN: Using Chinese bowed-stringed instrument as an example," arXiv:1910.09021, 2019.</w:t>
+      </w:r>
+    </w:p>
+    <w:p>
+      <w:pPr>
+        <w:pStyle w:val="BodyText"/>
+      </w:pPr>
+      <w:r>
+        <w:t xml:space="preserve">[9] D. Li, M. Che, W. Meng, Y. Wu, Y. Yu, F. Xia, and W. Li, "Playing technique detection by fusing note onset information in Guzheng performance," in</w:t>
+      </w:r>
+      <w:r>
+        <w:t xml:space="preserve"> </w:t>
+      </w:r>
+      <w:r>
+        <w:rPr>
+          <w:i/>
+          <w:iCs/>
+        </w:rPr>
+        <w:t xml:space="preserve">Proc. ISMIR</w:t>
+      </w:r>
+      <w:r>
+        <w:t xml:space="preserve">, 2022. arXiv:2209.08774.</w:t>
+      </w:r>
+    </w:p>
+    <w:p>
+      <w:pPr>
+        <w:pStyle w:val="BodyText"/>
+      </w:pPr>
+      <w:r>
+        <w:t xml:space="preserve">[10] D. Li, M. Che, W. Meng, Y. Wu, Y. Yu, F. Xia, and W. Li, "Frame-level multi-label playing technique detection using multi-scale network and self-attention mechanism," in</w:t>
+      </w:r>
+      <w:r>
+        <w:t xml:space="preserve"> </w:t>
+      </w:r>
+      <w:r>
+        <w:rPr>
+          <w:i/>
+          <w:iCs/>
+        </w:rPr>
+        <w:t xml:space="preserve">Proc. IEEE ICASSP</w:t>
+      </w:r>
+      <w:r>
+        <w:t xml:space="preserve">, 2023. arXiv:2303.13272.</w:t>
+      </w:r>
+    </w:p>
+    <w:p>
+      <w:pPr>
+        <w:pStyle w:val="BodyText"/>
+      </w:pPr>
+      <w:r>
+        <w:t xml:space="preserve">[11] H. S. Alar, R. O. Mamaril, L. P. Villegas, and J. R. D. Cabarrubias, "Audio classification of violin bowing techniques: An aid for beginners,"</w:t>
+      </w:r>
+      <w:r>
+        <w:t xml:space="preserve"> </w:t>
+      </w:r>
+      <w:r>
+        <w:rPr>
+          <w:i/>
+          <w:iCs/>
+        </w:rPr>
+        <w:t xml:space="preserve">Machine Learning with Applications</w:t>
+      </w:r>
+      <w:r>
+        <w:t xml:space="preserve">, vol. 4, art. 100028, 2021.</w:t>
+      </w:r>
+    </w:p>
+    <w:p>
+      <w:pPr>
+        <w:pStyle w:val="BodyText"/>
+      </w:pPr>
+      <w:r>
+        <w:t xml:space="preserve">[12] G. K. Chellamani, A. N., C. C., K. Kaur, and R. T. S. Babu, "SpectroFusionNet: A CNN approach utilizing spectrogram fusion for electric guitar play recognition,"</w:t>
+      </w:r>
+      <w:r>
+        <w:t xml:space="preserve"> </w:t>
+      </w:r>
+      <w:r>
+        <w:rPr>
+          <w:i/>
+          <w:iCs/>
+        </w:rPr>
+        <w:t xml:space="preserve">Scientific Reports</w:t>
+      </w:r>
+      <w:r>
+        <w:t xml:space="preserve">, vol. 15, art. 16842, 2025.</w:t>
+      </w:r>
+    </w:p>
+    <w:p>
+      <w:pPr>
+        <w:pStyle w:val="BodyText"/>
+      </w:pPr>
+      <w:r>
+        <w:t xml:space="preserve">[13] D. Li, Y. Ma, W. Wei, Q. Kong, Y. Wu, M. Che, F. Xia, E. Benetos, and W. Li, "MERTech: Instrument playing technique detection using self-supervised pretrained model with multi-task finetuning," in</w:t>
+      </w:r>
+      <w:r>
+        <w:t xml:space="preserve"> </w:t>
+      </w:r>
+      <w:r>
+        <w:rPr>
+          <w:i/>
+          <w:iCs/>
+        </w:rPr>
+        <w:t xml:space="preserve">Proc. IEEE ICASSP</w:t>
+      </w:r>
+      <w:r>
+        <w:t xml:space="preserve">, 2024. arXiv:2310.09853.</w:t>
+      </w:r>
+    </w:p>
+    <w:p>
+      <w:pPr>
+        <w:pStyle w:val="BodyText"/>
+      </w:pPr>
+      <w:r>
+        <w:t xml:space="preserve">[14] T.-K. Wang, Y.-P. Peng, L. Su, and V. K. M. Cheung, "VioPTT: Violin technique-aware transcription from synthetic data augmentation," arXiv:2509.23759, 2025.</w:t>
+      </w:r>
+    </w:p>
+    <w:p>
+      <w:pPr>
+        <w:pStyle w:val="BodyText"/>
+      </w:pPr>
+      <w:r>
+        <w:t xml:space="preserve">[15] D. Dalmazzo, S. Tassani, and R. Ramírez, "A machine learning approach to violin bow technique classification: a comparison between IMU and MOCAP systems," in</w:t>
+      </w:r>
+      <w:r>
+        <w:t xml:space="preserve"> </w:t>
+      </w:r>
+      <w:r>
+        <w:rPr>
+          <w:i/>
+          <w:iCs/>
+        </w:rPr>
+        <w:t xml:space="preserve">Proc. 5th Int. Workshop on Sensor-based Activity Recognition and Interaction (iWOAR)</w:t>
+      </w:r>
+      <w:r>
+        <w:t xml:space="preserve">, Berlin, 2018.</w:t>
+      </w:r>
+    </w:p>
+    <w:p>
+      <w:pPr>
+        <w:pStyle w:val="BodyText"/>
+      </w:pPr>
+      <w:r>
+        <w:t xml:space="preserve">[16] D. Dalmazzo and R. Ramírez, "Bowing gestures classification in violin performance: A machine learning approach,"</w:t>
+      </w:r>
+      <w:r>
+        <w:t xml:space="preserve"> </w:t>
+      </w:r>
+      <w:r>
+        <w:rPr>
+          <w:i/>
+          <w:iCs/>
+        </w:rPr>
+        <w:t xml:space="preserve">Frontiers in Psychology</w:t>
+      </w:r>
+      <w:r>
+        <w:t xml:space="preserve">, vol. 10, art. 344, 2019.</w:t>
+      </w:r>
+    </w:p>
+    <w:p>
+      <w:pPr>
+        <w:pStyle w:val="BodyText"/>
+      </w:pPr>
+      <w:r>
+        <w:t xml:space="preserve">[17] A. Oliver, A. Odena, C. Raffel, E. D. Cubuk, and I. J. Goodfellow, "Realistic evaluation of deep semi-supervised learning algorithms," in</w:t>
+      </w:r>
+      <w:r>
+        <w:t xml:space="preserve"> </w:t>
+      </w:r>
+      <w:r>
+        <w:rPr>
+          <w:i/>
+          <w:iCs/>
+        </w:rPr>
+        <w:t xml:space="preserve">Advances in Neural Information Processing Systems (NeurIPS)</w:t>
+      </w:r>
+      <w:r>
+        <w:t xml:space="preserve">, 2018, pp. 3239–3250.</w:t>
+      </w:r>
+    </w:p>
+    <w:p>
+      <w:pPr>
+        <w:pStyle w:val="BodyText"/>
+      </w:pPr>
+      <w:r>
+        <w:t xml:space="preserve">[18] K. Musgrave, S. Belongie, and S.-N. Lim, "A metric learning reality check," in</w:t>
+      </w:r>
+      <w:r>
+        <w:t xml:space="preserve"> </w:t>
+      </w:r>
+      <w:r>
+        <w:rPr>
+          <w:i/>
+          <w:iCs/>
+        </w:rPr>
+        <w:t xml:space="preserve">Proc. European Conf. Computer Vision (ECCV)</w:t>
+      </w:r>
+      <w:r>
+        <w:t xml:space="preserve">, 2020. arXiv:2003.08505.</w:t>
+      </w:r>
+    </w:p>
+    <w:p>
+      <w:pPr>
+        <w:pStyle w:val="BodyText"/>
+      </w:pPr>
+      <w:r>
+        <w:t xml:space="preserve">[19] S. Kapoor and A. Narayanan, "Leakage and the reproducibility crisis in machine-learning-based science,"</w:t>
+      </w:r>
+      <w:r>
+        <w:t xml:space="preserve"> </w:t>
+      </w:r>
+      <w:r>
+        <w:rPr>
+          <w:i/>
+          <w:iCs/>
+        </w:rPr>
+        <w:t xml:space="preserve">Patterns</w:t>
+      </w:r>
+      <w:r>
+        <w:t xml:space="preserve">, vol. 4, no. 9, art. 100804, 2023.</w:t>
+      </w:r>
+    </w:p>
+    <w:p>
+      <w:pPr>
+        <w:pStyle w:val="BodyText"/>
+      </w:pPr>
+      <w:r>
+        <w:t xml:space="preserve">[20] X. Bouthillier, P. Delaunay, M. Bronzi, et al., "Accounting for variance in machine learning benchmarks," in</w:t>
+      </w:r>
+      <w:r>
+        <w:t xml:space="preserve"> </w:t>
+      </w:r>
+      <w:r>
+        <w:rPr>
+          <w:i/>
+          <w:iCs/>
+        </w:rPr>
+        <w:t xml:space="preserve">Proc. Machine Learning and Systems (MLSys)</w:t>
+      </w:r>
+      <w:r>
+        <w:t xml:space="preserve">, 2021. arXiv:2103.03098.</w:t>
+      </w:r>
+    </w:p>
+    <w:p>
+      <w:pPr>
+        <w:pStyle w:val="BodyText"/>
+      </w:pPr>
+      <w:r>
+        <w:t xml:space="preserve">[21] A. Pasad, J.-C. Chou, and K. Livescu, "Layer-wise analysis of a self-supervised speech representation model," in</w:t>
+      </w:r>
+      <w:r>
+        <w:t xml:space="preserve"> </w:t>
+      </w:r>
+      <w:r>
+        <w:rPr>
+          <w:i/>
+          <w:iCs/>
+        </w:rPr>
+        <w:t xml:space="preserve">Proc. IEEE Automatic Speech Recognition and Understanding Workshop (ASRU)</w:t>
+      </w:r>
+      <w:r>
+        <w:t xml:space="preserve">, 2021. arXiv:2107.04734.</w:t>
+      </w:r>
+    </w:p>
+    <w:p>
+      <w:pPr>
+        <w:pStyle w:val="BodyText"/>
+      </w:pPr>
+      <w:r>
+        <w:t xml:space="preserve">[22] J. Hewitt and P. Liang, "Designing and interpreting probes with control tasks," in</w:t>
+      </w:r>
+      <w:r>
+        <w:t xml:space="preserve"> </w:t>
+      </w:r>
+      <w:r>
+        <w:rPr>
+          <w:i/>
+          <w:iCs/>
+        </w:rPr>
+        <w:t xml:space="preserve">Proc. Conf. Empirical Methods in Natural Language Processing (EMNLP-IJCNLP)</w:t>
+      </w:r>
+      <w:r>
+        <w:t xml:space="preserve">, 2019, pp. 2733–2743.</w:t>
+      </w:r>
+    </w:p>
+    <w:p>
+      <w:pPr>
+        <w:pStyle w:val="BodyText"/>
+      </w:pPr>
+      <w:r>
+        <w:t xml:space="preserve">[23] R. Yuan, Y. Ma, Y. Li, et al., "MARBLE: Music audio representation benchmark for universal evaluation," in</w:t>
+      </w:r>
+      <w:r>
+        <w:t xml:space="preserve"> </w:t>
+      </w:r>
+      <w:r>
+        <w:rPr>
+          <w:i/>
+          <w:iCs/>
+        </w:rPr>
+        <w:t xml:space="preserve">Advances in NeurIPS (Datasets and Benchmarks Track)</w:t>
+      </w:r>
+      <w:r>
+        <w:t xml:space="preserve">, 2023. arXiv:2306.10548.</w:t>
+      </w:r>
+    </w:p>
+    <w:p>
+      <w:pPr>
+        <w:pStyle w:val="BodyText"/>
+      </w:pPr>
+      <w:r>
+        <w:t xml:space="preserve">[24] Y. Wang, H. Chen, Y. Fan, et al., "USB: A unified semi-supervised learning benchmark for classification," in</w:t>
+      </w:r>
+      <w:r>
+        <w:t xml:space="preserve"> </w:t>
+      </w:r>
+      <w:r>
+        <w:rPr>
+          <w:i/>
+          <w:iCs/>
+        </w:rPr>
+        <w:t xml:space="preserve">Advances in NeurIPS (Datasets and Benchmarks Track)</w:t>
+      </w:r>
+      <w:r>
+        <w:t xml:space="preserve">, 2022. arXiv:2208.07204.</w:t>
+      </w:r>
+    </w:p>
+    <w:p>
+      <w:pPr>
+        <w:pStyle w:val="BodyText"/>
+      </w:pPr>
+      <w:r>
+        <w:t xml:space="preserve">[25] Y. Li, R. Yuan, G. Zhang, et al., "MERT: Acoustic music understanding model with large-scale self-supervised training," in</w:t>
+      </w:r>
+      <w:r>
+        <w:t xml:space="preserve"> </w:t>
+      </w:r>
+      <w:r>
+        <w:rPr>
+          <w:i/>
+          <w:iCs/>
+        </w:rPr>
+        <w:t xml:space="preserve">Proc. Int. Conf. Learning Representations (ICLR)</w:t>
+      </w:r>
+      <w:r>
+        <w:t xml:space="preserve">, 2024. arXiv:2306.00107.</w:t>
+      </w:r>
+    </w:p>
+    <w:p>
+      <w:pPr>
+        <w:pStyle w:val="BodyText"/>
+      </w:pPr>
+      <w:r>
+        <w:t xml:space="preserve">[26] A. Kumar, A. Raghunathan, R. Jones, T. Ma, and P. Liang, "Fine-tuning can distort pretrained features and underperform out-of-distribution," in</w:t>
+      </w:r>
+      <w:r>
+        <w:t xml:space="preserve"> </w:t>
+      </w:r>
+      <w:r>
+        <w:rPr>
+          <w:i/>
+          <w:iCs/>
+        </w:rPr>
+        <w:t xml:space="preserve">Proc. ICLR</w:t>
+      </w:r>
+      <w:r>
+        <w:t xml:space="preserve">, 2022. arXiv:2202.10054.</w:t>
+      </w:r>
+    </w:p>
+    <w:p>
+      <w:pPr>
+        <w:pStyle w:val="BodyText"/>
+      </w:pPr>
+      <w:r>
+        <w:t xml:space="preserve">[27] C. E. Cella, D. Ghisi, V. Lostanlen, F. Lévy, J. Fineberg, and Y. Maresz, "OrchideaSOL: A dataset of extended instrumental techniques for computer-aided orchestration," in</w:t>
+      </w:r>
+      <w:r>
+        <w:t xml:space="preserve"> </w:t>
+      </w:r>
+      <w:r>
+        <w:rPr>
+          <w:i/>
+          <w:iCs/>
+        </w:rPr>
+        <w:t xml:space="preserve">Proc. Int. Computer Music Conf. (ICMC)</w:t>
+      </w:r>
+      <w:r>
+        <w:t xml:space="preserve">, 2020. arXiv:2007.00763.</w:t>
+      </w:r>
+    </w:p>
+    <w:bookmarkEnd w:id="46"/>
+    <w:bookmarkEnd w:id="47"/>
     <w:sectPr>
       <w:footnotePr>
         <w:numRestart w:val="eachSect"/>

</xml_diff>